<commit_message>
Add +HMBC column: optional geminal-link result across all tables
Report magicmaus with the optional HMBC-HMQC geminal lever (--hmbc) on top of
+soft as a new column in Table 1, the README benchmark, and every per-example
README. HMBC lifts accuracy on every target, most where degeneracy is worst
(REC3 28.2->45.9%, MBP 79.7->89.1%). Each example now also ships
magicmaus_calls_hmbc.tsv alongside the +soft calls file. Regenerate docx.

Co-Authored-By: Claude Fable 5 <noreply@anthropic.com>
</commit_message>
<xml_diff>
--- a/magicmaus_AppNote.docx
+++ b/magicmaus_AppNote.docx
@@ -1378,25 +1378,58 @@
         <w:t xml:space="preserve"> </w:t>
       </w:r>
       <w:r>
-        <w:t xml:space="preserve">degenerate ones (HNH, REC3), so it is offered as an option, not a default.</w:t>
-      </w:r>
-      <w:r>
-        <w:t xml:space="preserve"> </w:t>
-      </w:r>
-      <w:r>
-        <w:t xml:space="preserve">Running the same scoring inside the MAUS bounds thus yields roughly an order of</w:t>
-      </w:r>
-      <w:r>
-        <w:t xml:space="preserve"> </w:t>
-      </w:r>
-      <w:r>
-        <w:t xml:space="preserve">magnitude more single-answer accuracy than scoring over the full space, at no</w:t>
-      </w:r>
-      <w:r>
-        <w:t xml:space="preserve"> </w:t>
-      </w:r>
-      <w:r>
-        <w:t xml:space="preserve">cost to the certainty guarantee.</w:t>
+        <w:t xml:space="preserve">degenerate ones (HNH, REC3), so it is offered as an option, not a default. Adding</w:t>
+      </w:r>
+      <w:r>
+        <w:t xml:space="preserve"> </w:t>
+      </w:r>
+      <w:r>
+        <w:t xml:space="preserve">one further optional input — an HMBC-HMQC experiment (</w:t>
+      </w:r>
+      <w:r>
+        <w:rPr>
+          <w:rStyle w:val="VerbatimChar"/>
+        </w:rPr>
+        <w:t xml:space="preserve">--hmbc</w:t>
+      </w:r>
+      <w:r>
+        <w:t xml:space="preserve">) that links each</w:t>
+      </w:r>
+      <w:r>
+        <w:t xml:space="preserve"> </w:t>
+      </w:r>
+      <w:r>
+        <w:t xml:space="preserve">Leu/Val geminal pair — lifts accuracy on every target (Table 1, +HMBC), most where</w:t>
+      </w:r>
+      <w:r>
+        <w:t xml:space="preserve"> </w:t>
+      </w:r>
+      <w:r>
+        <w:t xml:space="preserve">degeneracy is worst: REC3 rises 28.2% → 45.9% and MBP 79.7% → 89.1%, since geminal</w:t>
+      </w:r>
+      <w:r>
+        <w:t xml:space="preserve"> </w:t>
+      </w:r>
+      <w:r>
+        <w:t xml:space="preserve">ambiguity is precisely what an achiral NOE network cannot break. Running the same</w:t>
+      </w:r>
+      <w:r>
+        <w:t xml:space="preserve"> </w:t>
+      </w:r>
+      <w:r>
+        <w:t xml:space="preserve">scoring inside the MAUS bounds thus yields roughly an order of magnitude more</w:t>
+      </w:r>
+      <w:r>
+        <w:t xml:space="preserve"> </w:t>
+      </w:r>
+      <w:r>
+        <w:t xml:space="preserve">single-answer accuracy than scoring over the full space, at no cost to the</w:t>
+      </w:r>
+      <w:r>
+        <w:t xml:space="preserve"> </w:t>
+      </w:r>
+      <w:r>
+        <w:t xml:space="preserve">certainty guarantee, and improves monotonically as experimental input is added.</w:t>
       </w:r>
     </w:p>
     <w:p>
@@ -1450,17 +1483,19 @@
     <w:tbl>
       <w:tblPr>
         <w:tblStyle w:val="Table"/>
-        <w:tblW w:type="auto" w:w="0"/>
+        <w:tblW w:type="pct" w:w="5000"/>
+        <w:tblLayout w:type="fixed"/>
         <w:tblLook w:firstRow="1" w:lastRow="0" w:firstColumn="0" w:lastColumn="0" w:noHBand="0" w:noVBand="0" w:val="0020"/>
       </w:tblPr>
       <w:tblGrid>
-        <w:gridCol w:w="1131"/>
-        <w:gridCol w:w="1131"/>
-        <w:gridCol w:w="1131"/>
-        <w:gridCol w:w="1131"/>
-        <w:gridCol w:w="1131"/>
-        <w:gridCol w:w="1131"/>
-        <w:gridCol w:w="1131"/>
+        <w:gridCol w:w="792"/>
+        <w:gridCol w:w="792"/>
+        <w:gridCol w:w="1056"/>
+        <w:gridCol w:w="1056"/>
+        <w:gridCol w:w="1056"/>
+        <w:gridCol w:w="1056"/>
+        <w:gridCol w:w="1056"/>
+        <w:gridCol w:w="1056"/>
       </w:tblGrid>
       <w:tr>
         <w:trPr>
@@ -1544,6 +1579,18 @@
               <w:jc w:val="right"/>
             </w:pPr>
             <w:r>
+              <w:t xml:space="preserve">+HMBC</w:t>
+            </w:r>
+          </w:p>
+        </w:tc>
+        <w:tc>
+          <w:tcPr/>
+          <w:p>
+            <w:pPr>
+              <w:pStyle w:val="Compact"/>
+              <w:jc w:val="right"/>
+            </w:pPr>
+            <w:r>
               <w:t xml:space="preserve">Envelope</w:t>
             </w:r>
           </w:p>
@@ -1628,6 +1675,18 @@
               <w:jc w:val="right"/>
             </w:pPr>
             <w:r>
+              <w:t xml:space="preserve">89.8%</w:t>
+            </w:r>
+          </w:p>
+        </w:tc>
+        <w:tc>
+          <w:tcPr/>
+          <w:p>
+            <w:pPr>
+              <w:pStyle w:val="Compact"/>
+              <w:jc w:val="right"/>
+            </w:pPr>
+            <w:r>
               <w:t xml:space="preserve">100%</w:t>
             </w:r>
           </w:p>
@@ -1712,6 +1771,18 @@
               <w:jc w:val="right"/>
             </w:pPr>
             <w:r>
+              <w:t xml:space="preserve">64.9%</w:t>
+            </w:r>
+          </w:p>
+        </w:tc>
+        <w:tc>
+          <w:tcPr/>
+          <w:p>
+            <w:pPr>
+              <w:pStyle w:val="Compact"/>
+              <w:jc w:val="right"/>
+            </w:pPr>
+            <w:r>
               <w:t xml:space="preserve">100%</w:t>
             </w:r>
           </w:p>
@@ -1796,6 +1867,18 @@
               <w:jc w:val="right"/>
             </w:pPr>
             <w:r>
+              <w:t xml:space="preserve">82.5%</w:t>
+            </w:r>
+          </w:p>
+        </w:tc>
+        <w:tc>
+          <w:tcPr/>
+          <w:p>
+            <w:pPr>
+              <w:pStyle w:val="Compact"/>
+              <w:jc w:val="right"/>
+            </w:pPr>
+            <w:r>
               <w:t xml:space="preserve">100%</w:t>
             </w:r>
           </w:p>
@@ -1880,6 +1963,18 @@
               <w:jc w:val="right"/>
             </w:pPr>
             <w:r>
+              <w:t xml:space="preserve">45.9%</w:t>
+            </w:r>
+          </w:p>
+        </w:tc>
+        <w:tc>
+          <w:tcPr/>
+          <w:p>
+            <w:pPr>
+              <w:pStyle w:val="Compact"/>
+              <w:jc w:val="right"/>
+            </w:pPr>
+            <w:r>
               <w:t xml:space="preserve">100%</w:t>
             </w:r>
           </w:p>
@@ -1964,12 +2059,47 @@
               <w:jc w:val="right"/>
             </w:pPr>
             <w:r>
+              <w:t xml:space="preserve">89.1%</w:t>
+            </w:r>
+          </w:p>
+        </w:tc>
+        <w:tc>
+          <w:tcPr/>
+          <w:p>
+            <w:pPr>
+              <w:pStyle w:val="Compact"/>
+              <w:jc w:val="right"/>
+            </w:pPr>
+            <w:r>
               <w:t xml:space="preserve">100%</w:t>
             </w:r>
           </w:p>
         </w:tc>
       </w:tr>
     </w:tbl>
+    <w:p>
+      <w:pPr>
+        <w:pStyle w:val="BodyText"/>
+      </w:pPr>
+      <w:r>
+        <w:t xml:space="preserve">The +HMBC column adds an optional HMBC-HMQC geminal-link experiment (</w:t>
+      </w:r>
+      <w:r>
+        <w:rPr>
+          <w:rStyle w:val="VerbatimChar"/>
+        </w:rPr>
+        <w:t xml:space="preserve">--hmbc</w:t>
+      </w:r>
+      <w:r>
+        <w:t xml:space="preserve">) on</w:t>
+      </w:r>
+      <w:r>
+        <w:t xml:space="preserve"> </w:t>
+      </w:r>
+      <w:r>
+        <w:t xml:space="preserve">top of +soft, forcing each Leu/Val geminal pair onto its two structural methyls.</w:t>
+      </w:r>
+    </w:p>
     <w:bookmarkEnd w:id="13"/>
     <w:bookmarkStart w:id="14" w:name="conclusion"/>
     <w:p>

</xml_diff>

<commit_message>
Add MAUS column to all benchmark tables
Report the constraint layer alongside the others: MAUS commits only on the
unique peaks (all correct) and abstains on the rest, so its column is the
decisive fraction and its coverage is the 100% envelope. Added to Table 1, the
README benchmark, and every per-example README; docx regenerated.

Co-Authored-By: Claude Fable 5 <noreply@anthropic.com>
</commit_message>
<xml_diff>
--- a/magicmaus_AppNote.docx
+++ b/magicmaus_AppNote.docx
@@ -1488,14 +1488,15 @@
         <w:tblLook w:firstRow="1" w:lastRow="0" w:firstColumn="0" w:lastColumn="0" w:noHBand="0" w:noVBand="0" w:val="0020"/>
       </w:tblPr>
       <w:tblGrid>
-        <w:gridCol w:w="792"/>
-        <w:gridCol w:w="792"/>
-        <w:gridCol w:w="1056"/>
-        <w:gridCol w:w="1056"/>
-        <w:gridCol w:w="1056"/>
-        <w:gridCol w:w="1056"/>
-        <w:gridCol w:w="1056"/>
-        <w:gridCol w:w="1056"/>
+        <w:gridCol w:w="698"/>
+        <w:gridCol w:w="698"/>
+        <w:gridCol w:w="931"/>
+        <w:gridCol w:w="931"/>
+        <w:gridCol w:w="931"/>
+        <w:gridCol w:w="931"/>
+        <w:gridCol w:w="931"/>
+        <w:gridCol w:w="931"/>
+        <w:gridCol w:w="931"/>
       </w:tblGrid>
       <w:tr>
         <w:trPr>
@@ -1555,6 +1556,18 @@
               <w:jc w:val="right"/>
             </w:pPr>
             <w:r>
+              <w:t xml:space="preserve">MAUS</w:t>
+            </w:r>
+          </w:p>
+        </w:tc>
+        <w:tc>
+          <w:tcPr/>
+          <w:p>
+            <w:pPr>
+              <w:pStyle w:val="Compact"/>
+              <w:jc w:val="right"/>
+            </w:pPr>
+            <w:r>
               <w:t xml:space="preserve">magicmaus</w:t>
             </w:r>
           </w:p>
@@ -1651,6 +1664,18 @@
               <w:jc w:val="right"/>
             </w:pPr>
             <w:r>
+              <w:t xml:space="preserve">8.5%</w:t>
+            </w:r>
+          </w:p>
+        </w:tc>
+        <w:tc>
+          <w:tcPr/>
+          <w:p>
+            <w:pPr>
+              <w:pStyle w:val="Compact"/>
+              <w:jc w:val="right"/>
+            </w:pPr>
+            <w:r>
               <w:t xml:space="preserve">88.1%</w:t>
             </w:r>
           </w:p>
@@ -1747,6 +1772,18 @@
               <w:jc w:val="right"/>
             </w:pPr>
             <w:r>
+              <w:t xml:space="preserve">26.3%</w:t>
+            </w:r>
+          </w:p>
+        </w:tc>
+        <w:tc>
+          <w:tcPr/>
+          <w:p>
+            <w:pPr>
+              <w:pStyle w:val="Compact"/>
+              <w:jc w:val="right"/>
+            </w:pPr>
+            <w:r>
               <w:t xml:space="preserve">73.7%</w:t>
             </w:r>
           </w:p>
@@ -1843,6 +1880,18 @@
               <w:jc w:val="right"/>
             </w:pPr>
             <w:r>
+              <w:t xml:space="preserve">12.7%</w:t>
+            </w:r>
+          </w:p>
+        </w:tc>
+        <w:tc>
+          <w:tcPr/>
+          <w:p>
+            <w:pPr>
+              <w:pStyle w:val="Compact"/>
+              <w:jc w:val="right"/>
+            </w:pPr>
+            <w:r>
               <w:t xml:space="preserve">74.6%</w:t>
             </w:r>
           </w:p>
@@ -1939,6 +1988,18 @@
               <w:jc w:val="right"/>
             </w:pPr>
             <w:r>
+              <w:t xml:space="preserve">8.2%</w:t>
+            </w:r>
+          </w:p>
+        </w:tc>
+        <w:tc>
+          <w:tcPr/>
+          <w:p>
+            <w:pPr>
+              <w:pStyle w:val="Compact"/>
+              <w:jc w:val="right"/>
+            </w:pPr>
+            <w:r>
               <w:t xml:space="preserve">32.9%</w:t>
             </w:r>
           </w:p>
@@ -2035,6 +2096,18 @@
               <w:jc w:val="right"/>
             </w:pPr>
             <w:r>
+              <w:t xml:space="preserve">26.6%</w:t>
+            </w:r>
+          </w:p>
+        </w:tc>
+        <w:tc>
+          <w:tcPr/>
+          <w:p>
+            <w:pPr>
+              <w:pStyle w:val="Compact"/>
+              <w:jc w:val="right"/>
+            </w:pPr>
+            <w:r>
               <w:t xml:space="preserve">72.9%</w:t>
             </w:r>
           </w:p>
@@ -2082,7 +2155,19 @@
         <w:pStyle w:val="BodyText"/>
       </w:pPr>
       <w:r>
-        <w:t xml:space="preserve">The +HMBC column adds an optional HMBC-HMQC geminal-link experiment (</w:t>
+        <w:t xml:space="preserve">The MAUS column is the fraction of peaks it commits uniquely (all correct); on the</w:t>
+      </w:r>
+      <w:r>
+        <w:t xml:space="preserve"> </w:t>
+      </w:r>
+      <w:r>
+        <w:t xml:space="preserve">rest it abstains, so its coverage is the Envelope column (100%). The +HMBC column</w:t>
+      </w:r>
+      <w:r>
+        <w:t xml:space="preserve"> </w:t>
+      </w:r>
+      <w:r>
+        <w:t xml:space="preserve">adds an optional HMBC-HMQC geminal-link experiment (</w:t>
       </w:r>
       <w:r>
         <w:rPr>
@@ -2091,13 +2176,13 @@
         <w:t xml:space="preserve">--hmbc</w:t>
       </w:r>
       <w:r>
-        <w:t xml:space="preserve">) on</w:t>
-      </w:r>
-      <w:r>
-        <w:t xml:space="preserve"> </w:t>
-      </w:r>
-      <w:r>
-        <w:t xml:space="preserve">top of +soft, forcing each Leu/Val geminal pair onto its two structural methyls.</w:t>
+        <w:t xml:space="preserve">) on top of +soft,</w:t>
+      </w:r>
+      <w:r>
+        <w:t xml:space="preserve"> </w:t>
+      </w:r>
+      <w:r>
+        <w:t xml:space="preserve">forcing each Leu/Val geminal pair onto its two structural methyls.</w:t>
       </w:r>
     </w:p>
     <w:bookmarkEnd w:id="13"/>

</xml_diff>

<commit_message>
Add ubiquitin example (BMRB 6457 / PDB 1UBQ), the NMR reference protein
The famous large-protein methyl landmark (malate synthase G) has no public BMRB
methyl deposit, so add ubiquitin — biomolecular NMR's reference protein — with
complete ILV/AMT methyl assignments from BMRB 6457 (Cornilescu 1998) and PDB
1UBQ. magicmaus assigns all 43 methyls correctly (100%) on firm NOE alone vs
MAGIC's 9.3%, envelope 100%; the optional +soft/+HMBC levers slightly overfit
here (90.7%), so plain is best on a small well-resolved protein.

Add the sixth row to Table 1, README, and per-example READMEs; abstract/results
ranges updated to 43-192 methyls and 33-100%. docx regenerated.

Co-Authored-By: Claude Fable 5 <noreply@anthropic.com>
</commit_message>
<xml_diff>
--- a/magicmaus_AppNote.docx
+++ b/magicmaus_AppNote.docx
@@ -208,7 +208,7 @@
         <w:t xml:space="preserve"> </w:t>
       </w:r>
       <w:r>
-        <w:t xml:space="preserve">carrying a per-peak confidence tier. Across five benchmark targets (57–192</w:t>
+        <w:t xml:space="preserve">carrying a per-peak confidence tier. Across six benchmark targets (43–192</w:t>
       </w:r>
       <w:r>
         <w:t xml:space="preserve"> </w:t>
@@ -220,7 +220,7 @@
         <w:t xml:space="preserve"> </w:t>
       </w:r>
       <w:r>
-        <w:t xml:space="preserve">answer for every peak at 33–90% methyl-level accuracy — up to an order of</w:t>
+        <w:t xml:space="preserve">answer for every peak at 33–100% methyl-level accuracy — up to an order of</w:t>
       </w:r>
       <w:r>
         <w:t xml:space="preserve"> </w:t>
@@ -1103,7 +1103,13 @@
         <w:t xml:space="preserve"> </w:t>
       </w:r>
       <w:r>
-        <w:t xml:space="preserve">We benchmark five targets:</w:t>
+        <w:t xml:space="preserve">We benchmark six targets: ubiquitin (BMRB 6457, PDB 1UBQ; the reference protein</w:t>
+      </w:r>
+      <w:r>
+        <w:t xml:space="preserve"> </w:t>
+      </w:r>
+      <w:r>
+        <w:t xml:space="preserve">of biomolecular NMR),</w:t>
       </w:r>
       <w:r>
         <w:t xml:space="preserve"> </w:t>
@@ -1192,7 +1198,7 @@
         <w:t xml:space="preserve"> </w:t>
       </w:r>
       <w:r>
-        <w:t xml:space="preserve">Cas9 — spanning 57–192</w:t>
+        <w:t xml:space="preserve">Cas9 — spanning 43–192</w:t>
       </w:r>
       <w:r>
         <w:t xml:space="preserve"> </w:t>
@@ -1290,19 +1296,19 @@
           <w:b/>
           <w:bCs/>
         </w:rPr>
-        <w:t xml:space="preserve">73–90%</w:t>
-      </w:r>
-      <w:r>
-        <w:t xml:space="preserve"> </w:t>
-      </w:r>
-      <w:r>
-        <w:t xml:space="preserve">methyl-level accuracy on the four</w:t>
-      </w:r>
-      <w:r>
-        <w:t xml:space="preserve"> </w:t>
-      </w:r>
-      <w:r>
-        <w:t xml:space="preserve">smaller targets and</w:t>
+        <w:t xml:space="preserve">73–100%</w:t>
+      </w:r>
+      <w:r>
+        <w:t xml:space="preserve"> </w:t>
+      </w:r>
+      <w:r>
+        <w:t xml:space="preserve">methyl-level accuracy on the</w:t>
+      </w:r>
+      <w:r>
+        <w:t xml:space="preserve"> </w:t>
+      </w:r>
+      <w:r>
+        <w:t xml:space="preserve">smaller targets (a perfect 43/43 on ubiquitin) and</w:t>
       </w:r>
       <w:r>
         <w:t xml:space="preserve"> </w:t>
@@ -1318,13 +1324,13 @@
         <w:t xml:space="preserve"> </w:t>
       </w:r>
       <w:r>
-        <w:t xml:space="preserve">on MBP — up to an order of magnitude above scoring</w:t>
-      </w:r>
-      <w:r>
-        <w:t xml:space="preserve"> </w:t>
-      </w:r>
-      <w:r>
-        <w:t xml:space="preserve">over the full space. The one hard case is REC3, the largest and most degenerate</w:t>
+        <w:t xml:space="preserve">on MBP — up to an</w:t>
+      </w:r>
+      <w:r>
+        <w:t xml:space="preserve"> </w:t>
+      </w:r>
+      <w:r>
+        <w:t xml:space="preserve">order of magnitude above scoring over the full space. The one hard case is REC3, the largest and most degenerate</w:t>
       </w:r>
       <w:r>
         <w:t xml:space="preserve"> </w:t>
@@ -1605,6 +1611,114 @@
             </w:pPr>
             <w:r>
               <w:t xml:space="preserve">Envelope</w:t>
+            </w:r>
+          </w:p>
+        </w:tc>
+      </w:tr>
+      <w:tr>
+        <w:tc>
+          <w:tcPr/>
+          <w:p>
+            <w:pPr>
+              <w:pStyle w:val="Compact"/>
+            </w:pPr>
+            <w:r>
+              <w:t xml:space="preserve">Ubiquitin</w:t>
+            </w:r>
+          </w:p>
+        </w:tc>
+        <w:tc>
+          <w:tcPr/>
+          <w:p>
+            <w:pPr>
+              <w:pStyle w:val="Compact"/>
+            </w:pPr>
+            <w:r>
+              <w:t xml:space="preserve">6457 / 1UBQ</w:t>
+            </w:r>
+          </w:p>
+        </w:tc>
+        <w:tc>
+          <w:tcPr/>
+          <w:p>
+            <w:pPr>
+              <w:pStyle w:val="Compact"/>
+              <w:jc w:val="right"/>
+            </w:pPr>
+            <w:r>
+              <w:t xml:space="preserve">43</w:t>
+            </w:r>
+          </w:p>
+        </w:tc>
+        <w:tc>
+          <w:tcPr/>
+          <w:p>
+            <w:pPr>
+              <w:pStyle w:val="Compact"/>
+              <w:jc w:val="right"/>
+            </w:pPr>
+            <w:r>
+              <w:t xml:space="preserve">9.3%</w:t>
+            </w:r>
+          </w:p>
+        </w:tc>
+        <w:tc>
+          <w:tcPr/>
+          <w:p>
+            <w:pPr>
+              <w:pStyle w:val="Compact"/>
+              <w:jc w:val="right"/>
+            </w:pPr>
+            <w:r>
+              <w:t xml:space="preserve">34.9%</w:t>
+            </w:r>
+          </w:p>
+        </w:tc>
+        <w:tc>
+          <w:tcPr/>
+          <w:p>
+            <w:pPr>
+              <w:pStyle w:val="Compact"/>
+              <w:jc w:val="right"/>
+            </w:pPr>
+            <w:r>
+              <w:t xml:space="preserve">100%</w:t>
+            </w:r>
+          </w:p>
+        </w:tc>
+        <w:tc>
+          <w:tcPr/>
+          <w:p>
+            <w:pPr>
+              <w:pStyle w:val="Compact"/>
+              <w:jc w:val="right"/>
+            </w:pPr>
+            <w:r>
+              <w:t xml:space="preserve">90.7%</w:t>
+            </w:r>
+          </w:p>
+        </w:tc>
+        <w:tc>
+          <w:tcPr/>
+          <w:p>
+            <w:pPr>
+              <w:pStyle w:val="Compact"/>
+              <w:jc w:val="right"/>
+            </w:pPr>
+            <w:r>
+              <w:t xml:space="preserve">90.7%</w:t>
+            </w:r>
+          </w:p>
+        </w:tc>
+        <w:tc>
+          <w:tcPr/>
+          <w:p>
+            <w:pPr>
+              <w:pStyle w:val="Compact"/>
+              <w:jc w:val="right"/>
+            </w:pPr>
+            <w:r>
+              <w:t xml:space="preserve">100%</w:t>
             </w:r>
           </w:p>
         </w:tc>

</xml_diff>

<commit_message>
Update Figure 1B to the seven-target benchmark
Replace the MBP-only accuracy bars with a seven-target panel: magicmaus (+soft)
vs full-space MAGIC across ubiquitin, the Cas9 domains, MBP and MSG (ordered by
methyl count), with the 100% never-exclude envelope marked on each and MAGIC's
non-convergent targets hatched (n.c.). Caption updated to match; docx regenerated.

Co-Authored-By: Claude Fable 5 <noreply@anthropic.com>
</commit_message>
<xml_diff>
--- a/magicmaus_AppNote.docx
+++ b/magicmaus_AppNote.docx
@@ -3222,9 +3222,9 @@
       <w:r>
         <w:drawing>
           <wp:inline>
-            <wp:extent cx="5334000" cy="2140750"/>
+            <wp:extent cx="5334000" cy="2359174"/>
             <wp:effectExtent b="0" l="0" r="0" t="0"/>
-            <wp:docPr descr="Fig. 1. (A) The magicmaus pipeline. A SAT layer (MAUS) bounds each peak to a per-peak option set that provably contains the truth (100% envelope) and prunes candidates from up to ~60 to 1–3; an intensity-weighted NOE score (MAGIC-style), applied only within those bounds via a SAT-feasible seed and feasibility-preserving coordinate ascent, commits to a single coherent map with a per-peak confidence tier (unique / scored / ambiguous). (B) Methyl-level accuracy on maltose-binding protein (192 methyls), all engines scored on the same 1/r6 intensity NOESY. MAUS is decisive on 26.6% of peaks (rest abstain); MAGIC and magicmaus commit on all 192. Green markers denote the 100% truth-in-envelope guarantee, preserved by MAUS and magicmaus." title="" id="18" name="Picture"/>
+            <wp:docPr descr="Fig. 1. (A) The magicmaus pipeline. A SAT layer (MAUS) bounds each peak to a per-peak option set that provably contains the truth (100% envelope) and prunes candidates from up to ~60 to 1–3; an intensity-weighted NOE score (MAGIC-style), applied only within those bounds via a SAT-feasible seed and feasibility-preserving coordinate ascent, commits to a single coherent map with a per-peak confidence tier (unique / scored / ambiguous). (B) Methyl-level accuracy across the seven benchmark targets (43–257 methyls, ordered by size), all engines scored on the same 1/r6 intensity NOESY: magicmaus (+soft, blue) versus full-space MAGIC (red; hatched n.c. where scoring did not converge within a 15-min budget). Green markers denote the 100% truth-in-envelope guarantee, preserved on every target." title="" id="18" name="Picture"/>
             <a:graphic>
               <a:graphicData uri="http://schemas.openxmlformats.org/drawingml/2006/picture">
                 <pic:pic>
@@ -3243,7 +3243,7 @@
                   <pic:spPr bwMode="auto">
                     <a:xfrm>
                       <a:off x="0" y="0"/>
-                      <a:ext cx="5334000" cy="2140750"/>
+                      <a:ext cx="5334000" cy="2359174"/>
                     </a:xfrm>
                     <a:prstGeom prst="rect">
                       <a:avLst/>
@@ -3333,13 +3333,13 @@
         <w:t xml:space="preserve"> </w:t>
       </w:r>
       <w:r>
-        <w:t xml:space="preserve">accuracy on maltose-binding protein (192 methyls), all engines scored on the same</w:t>
-      </w:r>
-      <w:r>
-        <w:t xml:space="preserve"> </w:t>
-      </w:r>
-      <w:r>
-        <w:t xml:space="preserve">1/r</w:t>
+        <w:t xml:space="preserve">accuracy across the seven benchmark targets (43–257 methyls, ordered by size),</w:t>
+      </w:r>
+      <w:r>
+        <w:t xml:space="preserve"> </w:t>
+      </w:r>
+      <w:r>
+        <w:t xml:space="preserve">all engines scored on the same 1/r</w:t>
       </w:r>
       <w:r>
         <w:rPr>
@@ -3351,19 +3351,41 @@
         <w:t xml:space="preserve"> </w:t>
       </w:r>
       <w:r>
-        <w:t xml:space="preserve">intensity NOESY. MAUS is decisive on 26.6% of peaks (rest abstain); MAGIC</w:t>
-      </w:r>
-      <w:r>
-        <w:t xml:space="preserve"> </w:t>
-      </w:r>
-      <w:r>
-        <w:t xml:space="preserve">and magicmaus commit on all 192. Green markers denote the 100% truth-in-envelope</w:t>
-      </w:r>
-      <w:r>
-        <w:t xml:space="preserve"> </w:t>
-      </w:r>
-      <w:r>
-        <w:t xml:space="preserve">guarantee, preserved by MAUS and magicmaus.</w:t>
+        <w:t xml:space="preserve">intensity NOESY: magicmaus (+soft, blue)</w:t>
+      </w:r>
+      <w:r>
+        <w:t xml:space="preserve"> </w:t>
+      </w:r>
+      <w:r>
+        <w:t xml:space="preserve">versus full-space MAGIC (red; hatched</w:t>
+      </w:r>
+      <w:r>
+        <w:t xml:space="preserve"> </w:t>
+      </w:r>
+      <w:r>
+        <w:rPr>
+          <w:i/>
+          <w:iCs/>
+        </w:rPr>
+        <w:t xml:space="preserve">n.c.</w:t>
+      </w:r>
+      <w:r>
+        <w:t xml:space="preserve"> </w:t>
+      </w:r>
+      <w:r>
+        <w:t xml:space="preserve">where scoring did not converge within</w:t>
+      </w:r>
+      <w:r>
+        <w:t xml:space="preserve"> </w:t>
+      </w:r>
+      <w:r>
+        <w:t xml:space="preserve">a 15-min budget). Green markers denote the 100% truth-in-envelope guarantee,</w:t>
+      </w:r>
+      <w:r>
+        <w:t xml:space="preserve"> </w:t>
+      </w:r>
+      <w:r>
+        <w:t xml:space="preserve">preserved on every target.</w:t>
       </w:r>
     </w:p>
     <w:bookmarkEnd w:id="20"/>

</xml_diff>

<commit_message>
Fix Figure 1B label overlaps
Move the legend to a clear top-right band, the panel 'B' to top-left, and the
'envelope 100%' annotation into the whitespace left of the first bar (below the
dotted line, clear of the green markers). No text overlaps the bars, markers, or
each other. docx regenerated.

Co-Authored-By: Claude Fable 5 <noreply@anthropic.com>
</commit_message>
<xml_diff>
--- a/magicmaus_AppNote.docx
+++ b/magicmaus_AppNote.docx
@@ -3222,7 +3222,7 @@
       <w:r>
         <w:drawing>
           <wp:inline>
-            <wp:extent cx="5334000" cy="2359174"/>
+            <wp:extent cx="5334000" cy="2344023"/>
             <wp:effectExtent b="0" l="0" r="0" t="0"/>
             <wp:docPr descr="Fig. 1. (A) The magicmaus pipeline. A SAT layer (MAUS) bounds each peak to a per-peak option set that provably contains the truth (100% envelope) and prunes candidates from up to ~60 to 1–3; an intensity-weighted NOE score (MAGIC-style), applied only within those bounds via a SAT-feasible seed and feasibility-preserving coordinate ascent, commits to a single coherent map with a per-peak confidence tier (unique / scored / ambiguous). (B) Methyl-level accuracy across the seven benchmark targets (43–257 methyls, ordered by size), all engines scored on the same 1/r6 intensity NOESY: magicmaus (+soft, blue) versus full-space MAGIC (red; hatched n.c. where scoring did not converge within a 15-min budget). Green markers denote the 100% truth-in-envelope guarantee, preserved on every target." title="" id="18" name="Picture"/>
             <a:graphic>
@@ -3243,7 +3243,7 @@
                   <pic:spPr bwMode="auto">
                     <a:xfrm>
                       <a:off x="0" y="0"/>
-                      <a:ext cx="5334000" cy="2359174"/>
+                      <a:ext cx="5334000" cy="2344023"/>
                     </a:xfrm>
                     <a:prstGeom prst="rect">
                       <a:avLst/>

</xml_diff>

<commit_message>
Cite Siemons et al. 2019 for the HMBC-HMQC geminal-pairing experiment
Add the primary methodology reference for the 3D-HMBC-HMQC experiment that
links Leu/Val geminal methyl pairs (the --hmbc input), cited inline at first
mention and added to the reference list.

Co-Authored-By: Claude Opus 4.8 <noreply@anthropic.com>
</commit_message>
<xml_diff>
--- a/magicmaus_AppNote.docx
+++ b/magicmaus_AppNote.docx
@@ -1441,13 +1441,26 @@
         <w:t xml:space="preserve">--hmbc</w:t>
       </w:r>
       <w:r>
-        <w:t xml:space="preserve">) that links each</w:t>
-      </w:r>
-      <w:r>
-        <w:t xml:space="preserve"> </w:t>
-      </w:r>
-      <w:r>
-        <w:t xml:space="preserve">Leu/Val geminal pair — lifts accuracy on every target (Table 1, +HMBC), most where</w:t>
+        <w:t xml:space="preserve">; Siemons</w:t>
+      </w:r>
+      <w:r>
+        <w:t xml:space="preserve"> </w:t>
+      </w:r>
+      <w:r>
+        <w:rPr>
+          <w:i/>
+          <w:iCs/>
+        </w:rPr>
+        <w:t xml:space="preserve">et al.</w:t>
+      </w:r>
+      <w:r>
+        <w:t xml:space="preserve">,</w:t>
+      </w:r>
+      <w:r>
+        <w:t xml:space="preserve"> </w:t>
+      </w:r>
+      <w:r>
+        <w:t xml:space="preserve">2019) that links each Leu/Val geminal pair — lifts accuracy on every target (Table 1, +HMBC), most where</w:t>
       </w:r>
       <w:r>
         <w:t xml:space="preserve"> </w:t>
@@ -2991,6 +3004,52 @@
       </w:r>
       <w:r>
         <w:t xml:space="preserve">, 291–315.</w:t>
+      </w:r>
+    </w:p>
+    <w:p>
+      <w:pPr>
+        <w:pStyle w:val="BodyText"/>
+      </w:pPr>
+      <w:r>
+        <w:t xml:space="preserve">Siemons,L., Mackenzie,H.W., Shukla,V.K. and Hansen,D.F. (2019) Intra-residue</w:t>
+      </w:r>
+      <w:r>
+        <w:t xml:space="preserve"> </w:t>
+      </w:r>
+      <w:r>
+        <w:t xml:space="preserve">methyl–methyl correlations for valine and leucine residues in large proteins from</w:t>
+      </w:r>
+      <w:r>
+        <w:t xml:space="preserve"> </w:t>
+      </w:r>
+      <w:r>
+        <w:t xml:space="preserve">a 3D-HMBC-HMQC experiment.</w:t>
+      </w:r>
+      <w:r>
+        <w:t xml:space="preserve"> </w:t>
+      </w:r>
+      <w:r>
+        <w:rPr>
+          <w:i/>
+          <w:iCs/>
+        </w:rPr>
+        <w:t xml:space="preserve">J. Biomol. NMR</w:t>
+      </w:r>
+      <w:r>
+        <w:t xml:space="preserve">,</w:t>
+      </w:r>
+      <w:r>
+        <w:t xml:space="preserve"> </w:t>
+      </w:r>
+      <w:r>
+        <w:rPr>
+          <w:b/>
+          <w:bCs/>
+        </w:rPr>
+        <w:t xml:space="preserve">73</w:t>
+      </w:r>
+      <w:r>
+        <w:t xml:space="preserve">, 749–757.</w:t>
       </w:r>
     </w:p>
     <w:p>

</xml_diff>

<commit_message>
Cite Wen et al. 2012 for the methyl-methyl (H)CCH NOESY experiment
Add the primary methodology reference for the methyl-methyl (H)CCH NOESY the
simulated NOE network stands in for, cited inline where the network is
introduced and added to the reference list.

Co-Authored-By: Claude Opus 4.8 <noreply@anthropic.com>
</commit_message>
<xml_diff>
--- a/magicmaus_AppNote.docx
+++ b/magicmaus_AppNote.docx
@@ -1073,13 +1073,32 @@
         <w:t xml:space="preserve"> </w:t>
       </w:r>
       <w:r>
-        <w:t xml:space="preserve">Because BMRB deposits no NOESY peak list, a 3D (H)CCH network is simulated from</w:t>
-      </w:r>
-      <w:r>
-        <w:t xml:space="preserve"> </w:t>
-      </w:r>
-      <w:r>
-        <w:t xml:space="preserve">the structure (a cross peak for every methyl pair within 7.9 Å, both directions)</w:t>
+        <w:t xml:space="preserve">Because BMRB deposits no NOESY peak list, a methyl–methyl (H)CCH NOESY network</w:t>
+      </w:r>
+      <w:r>
+        <w:t xml:space="preserve"> </w:t>
+      </w:r>
+      <w:r>
+        <w:t xml:space="preserve">(Wen</w:t>
+      </w:r>
+      <w:r>
+        <w:t xml:space="preserve"> </w:t>
+      </w:r>
+      <w:r>
+        <w:rPr>
+          <w:i/>
+          <w:iCs/>
+        </w:rPr>
+        <w:t xml:space="preserve">et al.</w:t>
+      </w:r>
+      <w:r>
+        <w:t xml:space="preserve">, 2012) is simulated from the structure (a cross peak for every methyl</w:t>
+      </w:r>
+      <w:r>
+        <w:t xml:space="preserve"> </w:t>
+      </w:r>
+      <w:r>
+        <w:t xml:space="preserve">pair within 7.9 Å, both directions)</w:t>
       </w:r>
       <w:r>
         <w:t xml:space="preserve"> </w:t>
@@ -3265,6 +3284,46 @@
       </w:r>
       <w:r>
         <w:t xml:space="preserve">D402–D408.</w:t>
+      </w:r>
+    </w:p>
+    <w:p>
+      <w:pPr>
+        <w:pStyle w:val="BodyText"/>
+      </w:pPr>
+      <w:r>
+        <w:t xml:space="preserve">Wen,J., Zhou,P. and Wu,J. (2012) Efficient acquisition of high-resolution 4-D</w:t>
+      </w:r>
+      <w:r>
+        <w:t xml:space="preserve"> </w:t>
+      </w:r>
+      <w:r>
+        <w:t xml:space="preserve">diagonal-suppressed methyl–methyl NOESY for large proteins.</w:t>
+      </w:r>
+      <w:r>
+        <w:t xml:space="preserve"> </w:t>
+      </w:r>
+      <w:r>
+        <w:rPr>
+          <w:i/>
+          <w:iCs/>
+        </w:rPr>
+        <w:t xml:space="preserve">J. Magn. Reson.</w:t>
+      </w:r>
+      <w:r>
+        <w:t xml:space="preserve">,</w:t>
+      </w:r>
+      <w:r>
+        <w:t xml:space="preserve"> </w:t>
+      </w:r>
+      <w:r>
+        <w:rPr>
+          <w:b/>
+          <w:bCs/>
+        </w:rPr>
+        <w:t xml:space="preserve">218</w:t>
+      </w:r>
+      <w:r>
+        <w:t xml:space="preserve">, 128–132.</w:t>
       </w:r>
     </w:p>
     <w:p>

</xml_diff>

<commit_message>
Cite Rossi/Kalodimos et al. 2016 for SOFAST-edited 3D methyl NOESY
Add the Kalodimos-group NOESY methodology reference alongside Wen 2012 where
the methyl-methyl NOESY network is introduced, and to the reference list.

Co-Authored-By: Claude Opus 4.8 <noreply@anthropic.com>
</commit_message>
<xml_diff>
--- a/magicmaus_AppNote.docx
+++ b/magicmaus_AppNote.docx
@@ -1079,7 +1079,20 @@
         <w:t xml:space="preserve"> </w:t>
       </w:r>
       <w:r>
-        <w:t xml:space="preserve">(Wen</w:t>
+        <w:t xml:space="preserve">(Rossi</w:t>
+      </w:r>
+      <w:r>
+        <w:t xml:space="preserve"> </w:t>
+      </w:r>
+      <w:r>
+        <w:rPr>
+          <w:i/>
+          <w:iCs/>
+        </w:rPr>
+        <w:t xml:space="preserve">et al.</w:t>
+      </w:r>
+      <w:r>
+        <w:t xml:space="preserve">, 2016; Wen</w:t>
       </w:r>
       <w:r>
         <w:t xml:space="preserve"> </w:t>
@@ -3023,6 +3036,88 @@
       </w:r>
       <w:r>
         <w:t xml:space="preserve">, 291–315.</w:t>
+      </w:r>
+    </w:p>
+    <w:p>
+      <w:pPr>
+        <w:pStyle w:val="BodyText"/>
+      </w:pPr>
+      <w:r>
+        <w:t xml:space="preserve">Rossi,P., Xia,Y., Khanra,N., Veglia,G. and Kalodimos,C.G. (2016)</w:t>
+      </w:r>
+      <w:r>
+        <w:t xml:space="preserve"> </w:t>
+      </w:r>
+      <w:r>
+        <w:rPr>
+          <w:vertAlign w:val="superscript"/>
+        </w:rPr>
+        <w:t xml:space="preserve">15</w:t>
+      </w:r>
+      <w:r>
+        <w:t xml:space="preserve">N and</w:t>
+      </w:r>
+      <w:r>
+        <w:t xml:space="preserve"> </w:t>
+      </w:r>
+      <w:r>
+        <w:rPr>
+          <w:vertAlign w:val="superscript"/>
+        </w:rPr>
+        <w:t xml:space="preserve">13</w:t>
+      </w:r>
+      <w:r>
+        <w:t xml:space="preserve">C-SOFAST-HMQC editing enhances 3D-NOESY sensitivity in highly deuterated,</w:t>
+      </w:r>
+      <w:r>
+        <w:t xml:space="preserve"> </w:t>
+      </w:r>
+      <w:r>
+        <w:t xml:space="preserve">selectively [</w:t>
+      </w:r>
+      <w:r>
+        <w:rPr>
+          <w:vertAlign w:val="superscript"/>
+        </w:rPr>
+        <w:t xml:space="preserve">1</w:t>
+      </w:r>
+      <w:r>
+        <w:t xml:space="preserve">H,</w:t>
+      </w:r>
+      <w:r>
+        <w:rPr>
+          <w:vertAlign w:val="superscript"/>
+        </w:rPr>
+        <w:t xml:space="preserve">13</w:t>
+      </w:r>
+      <w:r>
+        <w:t xml:space="preserve">C]-labeled proteins.</w:t>
+      </w:r>
+      <w:r>
+        <w:t xml:space="preserve"> </w:t>
+      </w:r>
+      <w:r>
+        <w:rPr>
+          <w:i/>
+          <w:iCs/>
+        </w:rPr>
+        <w:t xml:space="preserve">J. Biomol. NMR</w:t>
+      </w:r>
+      <w:r>
+        <w:t xml:space="preserve">,</w:t>
+      </w:r>
+      <w:r>
+        <w:t xml:space="preserve"> </w:t>
+      </w:r>
+      <w:r>
+        <w:rPr>
+          <w:b/>
+          <w:bCs/>
+        </w:rPr>
+        <w:t xml:space="preserve">66</w:t>
+      </w:r>
+      <w:r>
+        <w:t xml:space="preserve">, 259–271.</w:t>
       </w:r>
     </w:p>
     <w:p>

</xml_diff>

<commit_message>
Reformat front/back matter to Bioinformatics App Note style
- Full author block with superscript affiliations and corresponding-author
  address, matching the journal template layout
- Author list: Choi, S.-Y. Lee, S. Koh, M. Yang, K.-S. Ryu, D. Lee
  (Koh and Yang added, both KBSI; Han and Carneiro removed)
- Add Acknowledgements, Conflict of interest, Funding, and Data availability
  back-matter sections (Funding per the KBSI internal-program grant numbers)
- Contact updated to the corresponding-author email

Co-Authored-By: Claude Opus 4.8 <noreply@anthropic.com>
</commit_message>
<xml_diff>
--- a/magicmaus_AppNote.docx
+++ b/magicmaus_AppNote.docx
@@ -22,7 +22,7 @@
         <w:t xml:space="preserve">Structural bioinformatics</w:t>
       </w:r>
     </w:p>
-    <w:bookmarkStart w:id="21" w:name="X32f9384308fffd6da93cfa87d2db732cab9912d"/>
+    <w:bookmarkStart w:id="25" w:name="X32f9384308fffd6da93cfa87d2db732cab9912d"/>
     <w:p>
       <w:pPr>
         <w:pStyle w:val="Heading1"/>
@@ -36,11 +36,7 @@
         <w:pStyle w:val="FirstParagraph"/>
       </w:pPr>
       <w:r>
-        <w:rPr>
-          <w:b/>
-          <w:bCs/>
-        </w:rPr>
-        <w:t xml:space="preserve">Donghan Lee</w:t>
+        <w:t xml:space="preserve">Joonhyeok Choi</w:t>
       </w:r>
       <w:r>
         <w:t xml:space="preserve"> </w:t>
@@ -49,7 +45,67 @@
         <w:rPr>
           <w:vertAlign w:val="superscript"/>
         </w:rPr>
-        <w:t xml:space="preserve">1,*</w:t>
+        <w:t xml:space="preserve">1,2,†</w:t>
+      </w:r>
+      <w:r>
+        <w:t xml:space="preserve">, Sang-Yeop Lee</w:t>
+      </w:r>
+      <w:r>
+        <w:t xml:space="preserve"> </w:t>
+      </w:r>
+      <w:r>
+        <w:rPr>
+          <w:vertAlign w:val="superscript"/>
+        </w:rPr>
+        <w:t xml:space="preserve">3,4,†</w:t>
+      </w:r>
+      <w:r>
+        <w:t xml:space="preserve">, Sooho Koh</w:t>
+      </w:r>
+      <w:r>
+        <w:t xml:space="preserve"> </w:t>
+      </w:r>
+      <w:r>
+        <w:rPr>
+          <w:vertAlign w:val="superscript"/>
+        </w:rPr>
+        <w:t xml:space="preserve">1</w:t>
+      </w:r>
+      <w:r>
+        <w:t xml:space="preserve">, Minjune Yang</w:t>
+      </w:r>
+      <w:r>
+        <w:t xml:space="preserve"> </w:t>
+      </w:r>
+      <w:r>
+        <w:rPr>
+          <w:vertAlign w:val="superscript"/>
+        </w:rPr>
+        <w:t xml:space="preserve">1</w:t>
+      </w:r>
+      <w:r>
+        <w:t xml:space="preserve">, Kyoung-Seok Ryu</w:t>
+      </w:r>
+      <w:r>
+        <w:t xml:space="preserve"> </w:t>
+      </w:r>
+      <w:r>
+        <w:rPr>
+          <w:vertAlign w:val="superscript"/>
+        </w:rPr>
+        <w:t xml:space="preserve">1,4</w:t>
+      </w:r>
+      <w:r>
+        <w:t xml:space="preserve">, Donghan Lee</w:t>
+      </w:r>
+      <w:r>
+        <w:t xml:space="preserve"> </w:t>
+      </w:r>
+      <w:r>
+        <w:rPr>
+          <w:vertAlign w:val="superscript"/>
+        </w:rPr>
+        <w:t xml:space="preserve">1,4,*</w:t>
       </w:r>
     </w:p>
     <w:p>
@@ -66,7 +122,7 @@
         <w:t xml:space="preserve"> </w:t>
       </w:r>
       <w:r>
-        <w:t xml:space="preserve">Korea Basic Science Institute, Ochang, Republic of Korea.</w:t>
+        <w:t xml:space="preserve">Center for Protein Structure and Drug Mechanism Research, Korea Basic Science Institute, Cheongju, 28119, Republic of Korea</w:t>
       </w:r>
     </w:p>
     <w:p>
@@ -77,13 +133,81 @@
         <w:rPr>
           <w:vertAlign w:val="superscript"/>
         </w:rPr>
+        <w:t xml:space="preserve">2</w:t>
+      </w:r>
+      <w:r>
+        <w:t xml:space="preserve"> </w:t>
+      </w:r>
+      <w:r>
+        <w:t xml:space="preserve">Department of Applied Pharmacy, College of Pharmacy, Chungbuk National University, Cheongju, 28160, Republic of Korea</w:t>
+      </w:r>
+    </w:p>
+    <w:p>
+      <w:pPr>
+        <w:pStyle w:val="BodyText"/>
+      </w:pPr>
+      <w:r>
+        <w:rPr>
+          <w:vertAlign w:val="superscript"/>
+        </w:rPr>
+        <w:t xml:space="preserve">3</w:t>
+      </w:r>
+      <w:r>
+        <w:t xml:space="preserve"> </w:t>
+      </w:r>
+      <w:r>
+        <w:t xml:space="preserve">Center for Target-to-Therapeutics Research, Korea Basic Science Institute, Cheongju, 28119, Republic of Korea</w:t>
+      </w:r>
+    </w:p>
+    <w:p>
+      <w:pPr>
+        <w:pStyle w:val="BodyText"/>
+      </w:pPr>
+      <w:r>
+        <w:rPr>
+          <w:vertAlign w:val="superscript"/>
+        </w:rPr>
+        <w:t xml:space="preserve">4</w:t>
+      </w:r>
+      <w:r>
+        <w:t xml:space="preserve"> </w:t>
+      </w:r>
+      <w:r>
+        <w:t xml:space="preserve">Department of Convergent Analytical Science, University of Science and Technology, Daejeon, 34113, Republic of Korea</w:t>
+      </w:r>
+    </w:p>
+    <w:p>
+      <w:pPr>
+        <w:pStyle w:val="BodyText"/>
+      </w:pPr>
+      <w:r>
+        <w:rPr>
+          <w:vertAlign w:val="superscript"/>
+        </w:rPr>
         <w:t xml:space="preserve">*</w:t>
       </w:r>
       <w:r>
         <w:t xml:space="preserve"> </w:t>
       </w:r>
       <w:r>
-        <w:t xml:space="preserve">To whom correspondence should be addressed.</w:t>
+        <w:t xml:space="preserve">Corresponding author. Donghan Lee, Center for Protein Structure and Drug Mechanism Research, Korea Basic Science Institute, Cheongju, 28119, Republic of Korea; Department of Convergent Analytical Science, University of Science and Technology, Daejeon, 34113, Republic of Korea (dlee04@kbsi.re.kr)</w:t>
+      </w:r>
+    </w:p>
+    <w:p>
+      <w:pPr>
+        <w:pStyle w:val="BodyText"/>
+      </w:pPr>
+      <w:r>
+        <w:rPr>
+          <w:vertAlign w:val="superscript"/>
+        </w:rPr>
+        <w:t xml:space="preserve">†</w:t>
+      </w:r>
+      <w:r>
+        <w:t xml:space="preserve"> </w:t>
+      </w:r>
+      <w:r>
+        <w:t xml:space="preserve">These authors contributed equally.</w:t>
       </w:r>
     </w:p>
     <w:p>
@@ -300,7 +424,7 @@
         <w:t xml:space="preserve"> </w:t>
       </w:r>
       <w:r>
-        <w:t xml:space="preserve">kbsi.bionmr@gmail.com</w:t>
+        <w:t xml:space="preserve">dlee04@kbsi.re.kr</w:t>
       </w:r>
     </w:p>
     <w:p>
@@ -2657,7 +2781,105 @@
       </w:r>
     </w:p>
     <w:bookmarkEnd w:id="16"/>
-    <w:bookmarkStart w:id="20" w:name="references"/>
+    <w:bookmarkStart w:id="17" w:name="acknowledgements-1"/>
+    <w:p>
+      <w:pPr>
+        <w:pStyle w:val="Heading2"/>
+      </w:pPr>
+      <w:r>
+        <w:t xml:space="preserve">Acknowledgements</w:t>
+      </w:r>
+    </w:p>
+    <w:p>
+      <w:pPr>
+        <w:pStyle w:val="FirstParagraph"/>
+      </w:pPr>
+      <w:r>
+        <w:t xml:space="preserve">The authors gratefully acknowledge Eun-Hee Kim and Dr. Hae-Kap Cheong from the</w:t>
+      </w:r>
+      <w:r>
+        <w:t xml:space="preserve"> </w:t>
+      </w:r>
+      <w:r>
+        <w:t xml:space="preserve">Korea Basic Science Institute (KBSI) for their valuable support and discussions.</w:t>
+      </w:r>
+    </w:p>
+    <w:bookmarkEnd w:id="17"/>
+    <w:bookmarkStart w:id="18" w:name="conflict-of-interest"/>
+    <w:p>
+      <w:pPr>
+        <w:pStyle w:val="Heading2"/>
+      </w:pPr>
+      <w:r>
+        <w:t xml:space="preserve">Conflict of interest</w:t>
+      </w:r>
+    </w:p>
+    <w:p>
+      <w:pPr>
+        <w:pStyle w:val="FirstParagraph"/>
+      </w:pPr>
+      <w:r>
+        <w:t xml:space="preserve">None declared.</w:t>
+      </w:r>
+    </w:p>
+    <w:bookmarkEnd w:id="18"/>
+    <w:bookmarkStart w:id="19" w:name="funding-1"/>
+    <w:p>
+      <w:pPr>
+        <w:pStyle w:val="Heading2"/>
+      </w:pPr>
+      <w:r>
+        <w:t xml:space="preserve">Funding</w:t>
+      </w:r>
+    </w:p>
+    <w:p>
+      <w:pPr>
+        <w:pStyle w:val="FirstParagraph"/>
+      </w:pPr>
+      <w:r>
+        <w:t xml:space="preserve">This work was supported by the Korea Basic Science Institute (KBSI) internal</w:t>
+      </w:r>
+      <w:r>
+        <w:t xml:space="preserve"> </w:t>
+      </w:r>
+      <w:r>
+        <w:t xml:space="preserve">research programs [C612120, C623200, C623300, C625130, and C539110].</w:t>
+      </w:r>
+    </w:p>
+    <w:bookmarkEnd w:id="19"/>
+    <w:bookmarkStart w:id="20" w:name="data-availability"/>
+    <w:p>
+      <w:pPr>
+        <w:pStyle w:val="Heading2"/>
+      </w:pPr>
+      <w:r>
+        <w:t xml:space="preserve">Data availability</w:t>
+      </w:r>
+    </w:p>
+    <w:p>
+      <w:pPr>
+        <w:pStyle w:val="FirstParagraph"/>
+      </w:pPr>
+      <w:r>
+        <w:t xml:space="preserve">The program underlying this article is available on the project website at</w:t>
+      </w:r>
+      <w:r>
+        <w:t xml:space="preserve"> </w:t>
+      </w:r>
+      <w:hyperlink r:id="rId9">
+        <w:r>
+          <w:rPr>
+            <w:rStyle w:val="Hyperlink"/>
+          </w:rPr>
+          <w:t xml:space="preserve">https://github.com/deepnmr/magicmaus</w:t>
+        </w:r>
+      </w:hyperlink>
+      <w:r>
+        <w:t xml:space="preserve">.</w:t>
+      </w:r>
+    </w:p>
+    <w:bookmarkEnd w:id="20"/>
+    <w:bookmarkStart w:id="24" w:name="references"/>
     <w:p>
       <w:pPr>
         <w:pStyle w:val="Heading2"/>
@@ -3437,18 +3659,18 @@
           <wp:inline>
             <wp:extent cx="5334000" cy="2344023"/>
             <wp:effectExtent b="0" l="0" r="0" t="0"/>
-            <wp:docPr descr="Fig. 1. (A) The magicmaus pipeline. A SAT layer (MAUS) bounds each peak to a per-peak option set that provably contains the truth (100% envelope) and prunes candidates from up to ~60 to 1–3; an intensity-weighted NOE score (MAGIC-style), applied only within those bounds via a SAT-feasible seed and feasibility-preserving coordinate ascent, commits to a single coherent map with a per-peak confidence tier (unique / scored / ambiguous). (B) Methyl-level accuracy across the seven benchmark targets (43–257 methyls, ordered by size), all engines scored on the same 1/r6 intensity NOESY: magicmaus (+soft, blue) versus full-space MAGIC (red; hatched n.c. where scoring did not converge within a 15-min budget). Green markers denote the 100% truth-in-envelope guarantee, preserved on every target." title="" id="18" name="Picture"/>
+            <wp:docPr descr="Fig. 1. (A) The magicmaus pipeline. A SAT layer (MAUS) bounds each peak to a per-peak option set that provably contains the truth (100% envelope) and prunes candidates from up to ~60 to 1–3; an intensity-weighted NOE score (MAGIC-style), applied only within those bounds via a SAT-feasible seed and feasibility-preserving coordinate ascent, commits to a single coherent map with a per-peak confidence tier (unique / scored / ambiguous). (B) Methyl-level accuracy across the seven benchmark targets (43–257 methyls, ordered by size), all engines scored on the same 1/r6 intensity NOESY: magicmaus (+soft, blue) versus full-space MAGIC (red; hatched n.c. where scoring did not converge within a 15-min budget). Green markers denote the 100% truth-in-envelope guarantee, preserved on every target." title="" id="22" name="Picture"/>
             <a:graphic>
               <a:graphicData uri="http://schemas.openxmlformats.org/drawingml/2006/picture">
                 <pic:pic>
                   <pic:nvPicPr>
-                    <pic:cNvPr descr="figure1.png" id="19" name="Picture"/>
+                    <pic:cNvPr descr="figure1.png" id="23" name="Picture"/>
                     <pic:cNvPicPr>
                       <a:picLocks noChangeArrowheads="1" noChangeAspect="1"/>
                     </pic:cNvPicPr>
                   </pic:nvPicPr>
                   <pic:blipFill>
-                    <a:blip r:embed="rId17"/>
+                    <a:blip r:embed="rId21"/>
                     <a:stretch>
                       <a:fillRect/>
                     </a:stretch>
@@ -3601,8 +3823,8 @@
         <w:t xml:space="preserve">preserved on every target.</w:t>
       </w:r>
     </w:p>
-    <w:bookmarkEnd w:id="20"/>
-    <w:bookmarkEnd w:id="21"/>
+    <w:bookmarkEnd w:id="24"/>
+    <w:bookmarkEnd w:id="25"/>
     <w:sectPr>
       <w:footnotePr>
         <w:numRestart w:val="eachSect"/>

</xml_diff>

<commit_message>
Add MAUS unique-only series to Figure 1B
Show the constraint layer's decisive fraction (MAUS unique calls, purple) as a
third bar alongside magicmaus+soft and MAGIC, so the figure makes the
SAT-bounds-vs-full-space contrast explicit. Caption updated.

Co-Authored-By: Claude Opus 4.8 <noreply@anthropic.com>
</commit_message>
<xml_diff>
--- a/magicmaus_AppNote.docx
+++ b/magicmaus_AppNote.docx
@@ -3657,9 +3657,9 @@
       <w:r>
         <w:drawing>
           <wp:inline>
-            <wp:extent cx="5334000" cy="2344023"/>
+            <wp:extent cx="5334000" cy="2336521"/>
             <wp:effectExtent b="0" l="0" r="0" t="0"/>
-            <wp:docPr descr="Fig. 1. (A) The magicmaus pipeline. A SAT layer (MAUS) bounds each peak to a per-peak option set that provably contains the truth (100% envelope) and prunes candidates from up to ~60 to 1–3; an intensity-weighted NOE score (MAGIC-style), applied only within those bounds via a SAT-feasible seed and feasibility-preserving coordinate ascent, commits to a single coherent map with a per-peak confidence tier (unique / scored / ambiguous). (B) Methyl-level accuracy across the seven benchmark targets (43–257 methyls, ordered by size), all engines scored on the same 1/r6 intensity NOESY: magicmaus (+soft, blue) versus full-space MAGIC (red; hatched n.c. where scoring did not converge within a 15-min budget). Green markers denote the 100% truth-in-envelope guarantee, preserved on every target." title="" id="22" name="Picture"/>
+            <wp:docPr descr="Fig. 1. (A) The magicmaus pipeline. A SAT layer (MAUS) bounds each peak to a per-peak option set that provably contains the truth (100% envelope) and prunes candidates from up to ~60 to 1–3; an intensity-weighted NOE score (MAGIC-style), applied only within those bounds via a SAT-feasible seed and feasibility-preserving coordinate ascent, commits to a single coherent map with a per-peak confidence tier (unique / scored / ambiguous). (B) Methyl-level accuracy across the seven benchmark targets (43–257 methyls, ordered by size), all engines scored on the same 1/r6 intensity NOESY: magicmaus (+soft, blue) versus MAUS unique-only calls (purple; the constraint layer’s decisive fraction, abstaining elsewhere) and full-space MAGIC (red; hatched n.c. where scoring did not converge within a 15-min budget). Green markers denote the 100% truth-in-envelope guarantee, preserved on every target." title="" id="22" name="Picture"/>
             <a:graphic>
               <a:graphicData uri="http://schemas.openxmlformats.org/drawingml/2006/picture">
                 <pic:pic>
@@ -3678,7 +3678,7 @@
                   <pic:spPr bwMode="auto">
                     <a:xfrm>
                       <a:off x="0" y="0"/>
-                      <a:ext cx="5334000" cy="2344023"/>
+                      <a:ext cx="5334000" cy="2336521"/>
                     </a:xfrm>
                     <a:prstGeom prst="rect">
                       <a:avLst/>
@@ -3792,7 +3792,13 @@
         <w:t xml:space="preserve"> </w:t>
       </w:r>
       <w:r>
-        <w:t xml:space="preserve">versus full-space MAGIC (red; hatched</w:t>
+        <w:t xml:space="preserve">versus MAUS unique-only calls (purple; the constraint layer’s decisive fraction,</w:t>
+      </w:r>
+      <w:r>
+        <w:t xml:space="preserve"> </w:t>
+      </w:r>
+      <w:r>
+        <w:t xml:space="preserve">abstaining elsewhere) and full-space MAGIC (red; hatched</w:t>
       </w:r>
       <w:r>
         <w:t xml:space="preserve"> </w:t>
@@ -3808,13 +3814,13 @@
         <w:t xml:space="preserve"> </w:t>
       </w:r>
       <w:r>
-        <w:t xml:space="preserve">where scoring did not converge within</w:t>
-      </w:r>
-      <w:r>
-        <w:t xml:space="preserve"> </w:t>
-      </w:r>
-      <w:r>
-        <w:t xml:space="preserve">a 15-min budget). Green markers denote the 100% truth-in-envelope guarantee,</w:t>
+        <w:t xml:space="preserve">where scoring did</w:t>
+      </w:r>
+      <w:r>
+        <w:t xml:space="preserve"> </w:t>
+      </w:r>
+      <w:r>
+        <w:t xml:space="preserve">not converge within a 15-min budget). Green markers denote the 100% truth-in-envelope guarantee,</w:t>
       </w:r>
       <w:r>
         <w:t xml:space="preserve"> </w:t>

</xml_diff>

<commit_message>
Set Table 1 font to 9 pt via pandoc reference doc
Add reference.docx (pandoc default with the Table paragraph style's run
size set to 9 pt) and build the App Note docx with --reference-doc so the
benchmark table renders at 9 pt. Build command noted at the top of the
manuscript source.

Co-Authored-By: Claude Opus 4.8 <noreply@anthropic.com>
</commit_message>
<xml_diff>
--- a/magicmaus_AppNote.docx
+++ b/magicmaus_AppNote.docx
@@ -4486,6 +4486,10 @@
     <w:semiHidden/>
     <w:unhideWhenUsed/>
     <w:qFormat/>
+    <w:rPr>
+      <w:sz w:val="18"/>
+      <w:szCs w:val="18"/>
+    </w:rPr>
     <w:tblPr>
       <w:tblInd w:type="dxa" w:w="0"/>
       <w:tblCellMar>

</xml_diff>

<commit_message>
Add a labeling-scheme column to the benchmark table
Each target's isotope-labeling scheme (which methyl residue types are observed)
was only in prose and the per-example READMEs. Surface it as a column in the
benchmark table (README + manuscript Table 1), between BMRB/PDB and methyls:
ILV for IL-2/REC2/REC3/MSG, AILMTV for ubiquitin/MBP, AILTV for HNH. Rebuild the
AppNote docx.

Co-Authored-By: Claude Fable 5 <noreply@anthropic.com>
</commit_message>
<xml_diff>
--- a/magicmaus_AppNote.docx
+++ b/magicmaus_AppNote.docx
@@ -1831,15 +1831,16 @@
         <w:tblLook w:firstRow="1" w:lastRow="0" w:firstColumn="0" w:lastColumn="0" w:noHBand="0" w:noVBand="0" w:val="0020"/>
       </w:tblPr>
       <w:tblGrid>
-        <w:gridCol w:w="698"/>
-        <w:gridCol w:w="698"/>
-        <w:gridCol w:w="931"/>
-        <w:gridCol w:w="931"/>
-        <w:gridCol w:w="931"/>
-        <w:gridCol w:w="931"/>
-        <w:gridCol w:w="931"/>
-        <w:gridCol w:w="931"/>
-        <w:gridCol w:w="931"/>
+        <w:gridCol w:w="642"/>
+        <w:gridCol w:w="642"/>
+        <w:gridCol w:w="642"/>
+        <w:gridCol w:w="856"/>
+        <w:gridCol w:w="856"/>
+        <w:gridCol w:w="856"/>
+        <w:gridCol w:w="856"/>
+        <w:gridCol w:w="856"/>
+        <w:gridCol w:w="856"/>
+        <w:gridCol w:w="856"/>
       </w:tblGrid>
       <w:tr>
         <w:trPr>
@@ -1872,6 +1873,17 @@
           <w:p>
             <w:pPr>
               <w:pStyle w:val="Compact"/>
+            </w:pPr>
+            <w:r>
+              <w:t xml:space="preserve">Labeling</w:t>
+            </w:r>
+          </w:p>
+        </w:tc>
+        <w:tc>
+          <w:tcPr/>
+          <w:p>
+            <w:pPr>
+              <w:pStyle w:val="Compact"/>
               <w:jc w:val="right"/>
             </w:pPr>
             <w:r>
@@ -1980,6 +1992,17 @@
           <w:p>
             <w:pPr>
               <w:pStyle w:val="Compact"/>
+            </w:pPr>
+            <w:r>
+              <w:t xml:space="preserve">AILMTV</w:t>
+            </w:r>
+          </w:p>
+        </w:tc>
+        <w:tc>
+          <w:tcPr/>
+          <w:p>
+            <w:pPr>
+              <w:pStyle w:val="Compact"/>
               <w:jc w:val="right"/>
             </w:pPr>
             <w:r>
@@ -2088,6 +2111,17 @@
           <w:p>
             <w:pPr>
               <w:pStyle w:val="Compact"/>
+            </w:pPr>
+            <w:r>
+              <w:t xml:space="preserve">ILV</w:t>
+            </w:r>
+          </w:p>
+        </w:tc>
+        <w:tc>
+          <w:tcPr/>
+          <w:p>
+            <w:pPr>
+              <w:pStyle w:val="Compact"/>
               <w:jc w:val="right"/>
             </w:pPr>
             <w:r>
@@ -2196,6 +2230,17 @@
           <w:p>
             <w:pPr>
               <w:pStyle w:val="Compact"/>
+            </w:pPr>
+            <w:r>
+              <w:t xml:space="preserve">AILTV</w:t>
+            </w:r>
+          </w:p>
+        </w:tc>
+        <w:tc>
+          <w:tcPr/>
+          <w:p>
+            <w:pPr>
+              <w:pStyle w:val="Compact"/>
               <w:jc w:val="right"/>
             </w:pPr>
             <w:r>
@@ -2304,6 +2349,17 @@
           <w:p>
             <w:pPr>
               <w:pStyle w:val="Compact"/>
+            </w:pPr>
+            <w:r>
+              <w:t xml:space="preserve">ILV</w:t>
+            </w:r>
+          </w:p>
+        </w:tc>
+        <w:tc>
+          <w:tcPr/>
+          <w:p>
+            <w:pPr>
+              <w:pStyle w:val="Compact"/>
               <w:jc w:val="right"/>
             </w:pPr>
             <w:r>
@@ -2412,6 +2468,17 @@
           <w:p>
             <w:pPr>
               <w:pStyle w:val="Compact"/>
+            </w:pPr>
+            <w:r>
+              <w:t xml:space="preserve">ILV</w:t>
+            </w:r>
+          </w:p>
+        </w:tc>
+        <w:tc>
+          <w:tcPr/>
+          <w:p>
+            <w:pPr>
+              <w:pStyle w:val="Compact"/>
               <w:jc w:val="right"/>
             </w:pPr>
             <w:r>
@@ -2520,6 +2587,17 @@
           <w:p>
             <w:pPr>
               <w:pStyle w:val="Compact"/>
+            </w:pPr>
+            <w:r>
+              <w:t xml:space="preserve">AILMTV</w:t>
+            </w:r>
+          </w:p>
+        </w:tc>
+        <w:tc>
+          <w:tcPr/>
+          <w:p>
+            <w:pPr>
+              <w:pStyle w:val="Compact"/>
               <w:jc w:val="right"/>
             </w:pPr>
             <w:r>
@@ -2620,6 +2698,17 @@
             </w:pPr>
             <w:r>
               <w:t xml:space="preserve">SI† / 1D8C</w:t>
+            </w:r>
+          </w:p>
+        </w:tc>
+        <w:tc>
+          <w:tcPr/>
+          <w:p>
+            <w:pPr>
+              <w:pStyle w:val="Compact"/>
+            </w:pPr>
+            <w:r>
+              <w:t xml:space="preserve">ILV</w:t>
             </w:r>
           </w:p>
         </w:tc>

</xml_diff>

<commit_message>
Discuss the labeling-scheme / assignment relationship
Add a paragraph at the end of Results tying the new Labeling column to assignment
difficulty. Labeling shapes the problem two ways: the number of labeled types
sets the candidate-partition granularity (AILMTV adds Ala/Thr/Met anchors and
shrinks domains; ILV concentrates peaks into three types), and the Leu/Val
fraction sets the irreducible geminal load that an achiral NOE network cannot
orient (Ile's single delta1 methyl is an anchor). Note that labeling is not the
sole determinant -- it interacts with NOE density: IL-2/REC2 are Leu-rich yet
score ~88-90% on dense networks, while REC3/MSG fall off from sparse firm NOEs,
not labeling alone. Map the two experimental levers (extended labeling, HMBC
geminal links) onto the two bottlenecks. Rebuild the AppNote docx.

Co-Authored-By: Claude Fable 5 <noreply@anthropic.com>
</commit_message>
<xml_diff>
--- a/magicmaus_AppNote.docx
+++ b/magicmaus_AppNote.docx
@@ -2867,6 +2867,155 @@
       </w:r>
       <w:r>
         <w:t xml:space="preserve">forcing each Leu/Val geminal pair onto its two structural methyls.</w:t>
+      </w:r>
+    </w:p>
+    <w:p>
+      <w:pPr>
+        <w:pStyle w:val="BodyText"/>
+      </w:pPr>
+      <w:r>
+        <w:t xml:space="preserve">The labeling scheme (Table 1) shapes the assignment problem in two ways that the</w:t>
+      </w:r>
+      <w:r>
+        <w:t xml:space="preserve"> </w:t>
+      </w:r>
+      <w:r>
+        <w:t xml:space="preserve">hybrid makes explicit. First, because a peak competes only with methyls of its own</w:t>
+      </w:r>
+      <w:r>
+        <w:t xml:space="preserve"> </w:t>
+      </w:r>
+      <w:r>
+        <w:t xml:space="preserve">residue type, the number of labeled types sets the granularity of the candidate</w:t>
+      </w:r>
+      <w:r>
+        <w:t xml:space="preserve"> </w:t>
+      </w:r>
+      <w:r>
+        <w:t xml:space="preserve">partition: the two AILMTV targets (ubiquitin, MBP) spread their peaks over six</w:t>
+      </w:r>
+      <w:r>
+        <w:t xml:space="preserve"> </w:t>
+      </w:r>
+      <w:r>
+        <w:t xml:space="preserve">types, and the added Ala/Thr/Met probes both shrink each peak’s candidate domain</w:t>
+      </w:r>
+      <w:r>
+        <w:t xml:space="preserve"> </w:t>
+      </w:r>
+      <w:r>
+        <w:t xml:space="preserve">and act as isolated anchors — Ala Cβ and Thr Cγ2 are single, non-prochiral methyls</w:t>
+      </w:r>
+      <w:r>
+        <w:t xml:space="preserve"> </w:t>
+      </w:r>
+      <w:r>
+        <w:t xml:space="preserve">whose assignments, once fixed, propagate through the NOE network. The four ILV</w:t>
+      </w:r>
+      <w:r>
+        <w:t xml:space="preserve"> </w:t>
+      </w:r>
+      <w:r>
+        <w:t xml:space="preserve">targets instead concentrate every peak into three types, so the domains are larger</w:t>
+      </w:r>
+      <w:r>
+        <w:t xml:space="preserve"> </w:t>
+      </w:r>
+      <w:r>
+        <w:t xml:space="preserve">and the search rests entirely on the Ile/Leu/Val network. Second, labeling sets the</w:t>
+      </w:r>
+      <w:r>
+        <w:t xml:space="preserve"> </w:t>
+      </w:r>
+      <w:r>
+        <w:t xml:space="preserve">irreducible geminal load: Leu (δ1/δ2) and Val (γ1/γ2) carry prochiral methyl pairs</w:t>
+      </w:r>
+      <w:r>
+        <w:t xml:space="preserve"> </w:t>
+      </w:r>
+      <w:r>
+        <w:t xml:space="preserve">that an achiral NOE network cannot orient, whereas Ile contributes a single δ1</w:t>
+      </w:r>
+      <w:r>
+        <w:t xml:space="preserve"> </w:t>
+      </w:r>
+      <w:r>
+        <w:t xml:space="preserve">methyl and so is an unambiguous anchor. This is why the residual</w:t>
+      </w:r>
+      <w:r>
+        <w:t xml:space="preserve"> </w:t>
+      </w:r>
+      <w:r>
+        <w:rPr>
+          <w:rStyle w:val="VerbatimChar"/>
+        </w:rPr>
+        <w:t xml:space="preserve">ambiguous</w:t>
+      </w:r>
+      <w:r>
+        <w:t xml:space="preserve"> </w:t>
+      </w:r>
+      <w:r>
+        <w:t xml:space="preserve">tier is</w:t>
+      </w:r>
+      <w:r>
+        <w:t xml:space="preserve"> </w:t>
+      </w:r>
+      <w:r>
+        <w:t xml:space="preserve">dominated by Leu/Val pairs and why the geminal-resolving HMBC lever, not more NOEs,</w:t>
+      </w:r>
+      <w:r>
+        <w:t xml:space="preserve"> </w:t>
+      </w:r>
+      <w:r>
+        <w:t xml:space="preserve">is what lifts the Leu-dense targets. Labeling is not the sole determinant of</w:t>
+      </w:r>
+      <w:r>
+        <w:t xml:space="preserve"> </w:t>
+      </w:r>
+      <w:r>
+        <w:t xml:space="preserve">difficulty, however: it interacts with NOE information content. IL-2 and REC2 are</w:t>
+      </w:r>
+      <w:r>
+        <w:t xml:space="preserve"> </w:t>
+      </w:r>
+      <w:r>
+        <w:t xml:space="preserve">Leu-rich (71% and 76% Leu) yet reach ~88–90% because their NOE networks are dense,</w:t>
+      </w:r>
+      <w:r>
+        <w:t xml:space="preserve"> </w:t>
+      </w:r>
+      <w:r>
+        <w:t xml:space="preserve">while REC3 and MSG fall to 60% and 30% not from their labeling alone but because</w:t>
+      </w:r>
+      <w:r>
+        <w:t xml:space="preserve"> </w:t>
+      </w:r>
+      <w:r>
+        <w:t xml:space="preserve">sparse carbon-only matching leaves too few firm NOEs to pin the enlarged ILV</w:t>
+      </w:r>
+      <w:r>
+        <w:t xml:space="preserve"> </w:t>
+      </w:r>
+      <w:r>
+        <w:t xml:space="preserve">domains (Section 3, coverage gate). In practice the two levers of the experiment map</w:t>
+      </w:r>
+      <w:r>
+        <w:t xml:space="preserve"> </w:t>
+      </w:r>
+      <w:r>
+        <w:t xml:space="preserve">onto the two bottlenecks: extending the labeling beyond ILV partitions the problem</w:t>
+      </w:r>
+      <w:r>
+        <w:t xml:space="preserve"> </w:t>
+      </w:r>
+      <w:r>
+        <w:t xml:space="preserve">and supplies anchors, while an HMBC geminal-link experiment removes the Leu/Val</w:t>
+      </w:r>
+      <w:r>
+        <w:t xml:space="preserve"> </w:t>
+      </w:r>
+      <w:r>
+        <w:t xml:space="preserve">symmetry that no methyl–methyl NOE network can break.</w:t>
       </w:r>
     </w:p>
     <w:bookmarkEnd w:id="13"/>

</xml_diff>

<commit_message>
TNF-α: add MAGIC column + Table 2/3 residue/atom rows
Run MAGIC on the single protomer (it has no multimer support): 5/85 = 5.9%
methyl (residue-level 8.2%), scored by the same exact-match logic as every
other MAGIC cell. tnfa_protomer.pdb (chain 1 of the AF3 model in PDB format)
and the committed magic_assignments.tsv are added; magic_run_tnfa/ stays
gitignored like the other MAGIC bundles.

Table 1 MAGIC column —→5.9%; TNF-α rows added to Table 2 (by type) and
Table 3 (by methyl carbon), computed from magicmaus_calls.tsv (+soft): Ile
8/8, but Leu 6% and Val 27% as the boolean (H)CCH intensities cannot orient
the geminal pairs. figure1.png now draws the real MAGIC bar; AppNote.docx
rebuilt.

Co-Authored-By: Claude Fable 5 <noreply@anthropic.com>
</commit_message>
<xml_diff>
--- a/magicmaus_AppNote.docx
+++ b/magicmaus_AppNote.docx
@@ -3163,7 +3163,7 @@
               <w:jc w:val="right"/>
             </w:pPr>
             <w:r>
-              <w:t xml:space="preserve">—</w:t>
+              <w:t xml:space="preserve">5.9%</w:t>
             </w:r>
           </w:p>
         </w:tc>
@@ -4367,7 +4367,144 @@
           </w:p>
         </w:tc>
       </w:tr>
+      <w:tr>
+        <w:tc>
+          <w:tcPr/>
+          <w:p>
+            <w:pPr>
+              <w:pStyle w:val="Compact"/>
+            </w:pPr>
+            <w:r>
+              <w:t xml:space="preserve">TNF-α</w:t>
+            </w:r>
+          </w:p>
+        </w:tc>
+        <w:tc>
+          <w:tcPr/>
+          <w:p>
+            <w:pPr>
+              <w:pStyle w:val="Compact"/>
+            </w:pPr>
+            <w:r>
+              <w:t xml:space="preserve">100% (8/8)</w:t>
+            </w:r>
+          </w:p>
+        </w:tc>
+        <w:tc>
+          <w:tcPr/>
+          <w:p>
+            <w:pPr>
+              <w:pStyle w:val="Compact"/>
+            </w:pPr>
+            <w:r>
+              <w:t xml:space="preserve">6% (2/36)</w:t>
+            </w:r>
+          </w:p>
+        </w:tc>
+        <w:tc>
+          <w:tcPr/>
+          <w:p>
+            <w:pPr>
+              <w:pStyle w:val="Compact"/>
+            </w:pPr>
+            <w:r>
+              <w:t xml:space="preserve">27% (7/26)</w:t>
+            </w:r>
+          </w:p>
+        </w:tc>
+        <w:tc>
+          <w:tcPr/>
+          <w:p>
+            <w:pPr>
+              <w:pStyle w:val="Compact"/>
+            </w:pPr>
+            <w:r>
+              <w:t xml:space="preserve">50% (6/12)</w:t>
+            </w:r>
+          </w:p>
+        </w:tc>
+        <w:tc>
+          <w:tcPr/>
+          <w:p>
+            <w:pPr>
+              <w:pStyle w:val="Compact"/>
+            </w:pPr>
+            <w:r>
+              <w:t xml:space="preserve">33% (1/3)</w:t>
+            </w:r>
+          </w:p>
+        </w:tc>
+        <w:tc>
+          <w:tcPr/>
+          <w:p>
+            <w:pPr>
+              <w:pStyle w:val="Compact"/>
+            </w:pPr>
+            <w:r>
+              <w:t xml:space="preserve">—</w:t>
+            </w:r>
+          </w:p>
+        </w:tc>
+        <w:tc>
+          <w:tcPr/>
+          <w:p>
+            <w:pPr>
+              <w:pStyle w:val="Compact"/>
+            </w:pPr>
+            <w:r>
+              <w:t xml:space="preserve">28% (24/85)</w:t>
+            </w:r>
+          </w:p>
+        </w:tc>
+      </w:tr>
     </w:tbl>
+    <w:p>
+      <w:pPr>
+        <w:pStyle w:val="BodyText"/>
+      </w:pPr>
+      <w:r>
+        <w:t xml:space="preserve">The real-data TNF-α row makes the type dependence stark: Ile (no geminal partner)</w:t>
+      </w:r>
+      <w:r>
+        <w:t xml:space="preserve"> </w:t>
+      </w:r>
+      <w:r>
+        <w:t xml:space="preserve">is again assigned outright (8/8), Ala and Thr are middling on a sparse network,</w:t>
+      </w:r>
+      <w:r>
+        <w:t xml:space="preserve"> </w:t>
+      </w:r>
+      <w:r>
+        <w:t xml:space="preserve">but Leu collapses to 6% (2/36) and Val to 27% — the near-flat, boolean-dominated</w:t>
+      </w:r>
+      <w:r>
+        <w:t xml:space="preserve"> </w:t>
+      </w:r>
+      <w:r>
+        <w:t xml:space="preserve">(H)CCH intensities cannot orient the geminal pairs, so most Leu/Val calls are the</w:t>
+      </w:r>
+      <w:r>
+        <w:t xml:space="preserve"> </w:t>
+      </w:r>
+      <w:r>
+        <w:rPr>
+          <w:rStyle w:val="VerbatimChar"/>
+        </w:rPr>
+        <w:t xml:space="preserve">ambiguous</w:t>
+      </w:r>
+      <w:r>
+        <w:t xml:space="preserve"> </w:t>
+      </w:r>
+      <w:r>
+        <w:t xml:space="preserve">coin flip landing on the wrong δ/γ methyl (they stay inside the MAUS</w:t>
+      </w:r>
+      <w:r>
+        <w:t xml:space="preserve"> </w:t>
+      </w:r>
+      <w:r>
+        <w:t xml:space="preserve">envelope; only the intensity signal, weak here, could break the tie).</w:t>
+      </w:r>
+    </w:p>
     <w:p>
       <w:pPr>
         <w:pStyle w:val="BodyText"/>
@@ -5352,6 +5489,107 @@
             </w:pPr>
             <w:r>
               <w:t xml:space="preserve">—</w:t>
+            </w:r>
+          </w:p>
+        </w:tc>
+        <w:tc>
+          <w:tcPr/>
+          <w:p>
+            <w:pPr>
+              <w:pStyle w:val="Compact"/>
+            </w:pPr>
+            <w:r>
+              <w:t xml:space="preserve">—</w:t>
+            </w:r>
+          </w:p>
+        </w:tc>
+      </w:tr>
+      <w:tr>
+        <w:tc>
+          <w:tcPr/>
+          <w:p>
+            <w:pPr>
+              <w:pStyle w:val="Compact"/>
+            </w:pPr>
+            <w:r>
+              <w:t xml:space="preserve">TNF-α</w:t>
+            </w:r>
+          </w:p>
+        </w:tc>
+        <w:tc>
+          <w:tcPr/>
+          <w:p>
+            <w:pPr>
+              <w:pStyle w:val="Compact"/>
+            </w:pPr>
+            <w:r>
+              <w:t xml:space="preserve">100% (8/8)</w:t>
+            </w:r>
+          </w:p>
+        </w:tc>
+        <w:tc>
+          <w:tcPr/>
+          <w:p>
+            <w:pPr>
+              <w:pStyle w:val="Compact"/>
+            </w:pPr>
+            <w:r>
+              <w:t xml:space="preserve">6% (1/18)</w:t>
+            </w:r>
+          </w:p>
+        </w:tc>
+        <w:tc>
+          <w:tcPr/>
+          <w:p>
+            <w:pPr>
+              <w:pStyle w:val="Compact"/>
+            </w:pPr>
+            <w:r>
+              <w:t xml:space="preserve">6% (1/18)</w:t>
+            </w:r>
+          </w:p>
+        </w:tc>
+        <w:tc>
+          <w:tcPr/>
+          <w:p>
+            <w:pPr>
+              <w:pStyle w:val="Compact"/>
+            </w:pPr>
+            <w:r>
+              <w:t xml:space="preserve">31% (4/13)</w:t>
+            </w:r>
+          </w:p>
+        </w:tc>
+        <w:tc>
+          <w:tcPr/>
+          <w:p>
+            <w:pPr>
+              <w:pStyle w:val="Compact"/>
+            </w:pPr>
+            <w:r>
+              <w:t xml:space="preserve">23% (3/13)</w:t>
+            </w:r>
+          </w:p>
+        </w:tc>
+        <w:tc>
+          <w:tcPr/>
+          <w:p>
+            <w:pPr>
+              <w:pStyle w:val="Compact"/>
+            </w:pPr>
+            <w:r>
+              <w:t xml:space="preserve">50% (6/12)</w:t>
+            </w:r>
+          </w:p>
+        </w:tc>
+        <w:tc>
+          <w:tcPr/>
+          <w:p>
+            <w:pPr>
+              <w:pStyle w:val="Compact"/>
+            </w:pPr>
+            <w:r>
+              <w:t xml:space="preserve">33% (1/3)</w:t>
             </w:r>
           </w:p>
         </w:tc>

</xml_diff>

<commit_message>
Use revised HMBC-HMQC peak list; --hmbc now helps at both tolerances
The updated TNFa_ILVAT_HMBC_HMQC.list is clean (reciprocal correlations per
Leu/Val geminal pair). Regenerated hmbc.tsv and the committed calls. With the
new list --hmbc no longer collapses the SAT at the tight tolerance:

  H+-0.01/C+-0.05  +HMBC+soft: envelope 92.9%, committed 28.2 -> 29.4%
  H+-0.02/C+-0.1   +HMBC+soft: committed 11.8 -> 17.6%

Updated the manuscript/README prose that previously called HMBC tight-tolerance
collapse a limitation -- it was an artefact of the earlier noisy list.

Co-Authored-By: Claude Fable 5 <noreply@anthropic.com>
</commit_message>
<xml_diff>
--- a/magicmaus_AppNote.docx
+++ b/magicmaus_AppNote.docx
@@ -2051,25 +2051,31 @@
         <w:t xml:space="preserve"> </w:t>
       </w:r>
       <w:r>
-        <w:t xml:space="preserve">committed call from 11.8 to 17.6% by coupling the geminal pairs’ NOE evidence; at</w:t>
-      </w:r>
-      <w:r>
-        <w:t xml:space="preserve"> </w:t>
-      </w:r>
-      <w:r>
-        <w:t xml:space="preserve">this tolerance the sparse HMBC matches (4 of 69 firm) are clean enough to inform</w:t>
-      </w:r>
-      <w:r>
-        <w:t xml:space="preserve"> </w:t>
-      </w:r>
-      <w:r>
-        <w:t xml:space="preserve">rather than over-constrain, unlike the tighter-tolerance regime where a single</w:t>
-      </w:r>
-      <w:r>
-        <w:t xml:space="preserve"> </w:t>
-      </w:r>
-      <w:r>
-        <w:t xml:space="preserve">mismatched geminal link can render the SAT infeasible.</w:t>
+        <w:t xml:space="preserve">committed call from 11.8 to 17.6% by coupling the geminal pairs’ NOE evidence</w:t>
+      </w:r>
+      <w:r>
+        <w:t xml:space="preserve"> </w:t>
+      </w:r>
+      <w:r>
+        <w:t xml:space="preserve">(and, at the tighter H±0.01/C±0.05 tolerance, from 28.2 to 29.4% at a 92.9%</w:t>
+      </w:r>
+      <w:r>
+        <w:t xml:space="preserve"> </w:t>
+      </w:r>
+      <w:r>
+        <w:t xml:space="preserve">envelope). The HMBC-HMQC geminal peak list is clean enough — reciprocal</w:t>
+      </w:r>
+      <w:r>
+        <w:t xml:space="preserve"> </w:t>
+      </w:r>
+      <w:r>
+        <w:t xml:space="preserve">correlations for each Leu/Val pair — that its hard links inform rather than</w:t>
+      </w:r>
+      <w:r>
+        <w:t xml:space="preserve"> </w:t>
+      </w:r>
+      <w:r>
+        <w:t xml:space="preserve">over-constrain, never rendering the SAT infeasible.</w:t>
       </w:r>
     </w:p>
     <w:p>

</xml_diff>

<commit_message>
Regenerate AppNote.docx from updated manuscript (TNFα symmetric numbers)
Co-Authored-By: Claude Opus 4.8 <noreply@anthropic.com>
</commit_message>
<xml_diff>
--- a/magicmaus_AppNote.docx
+++ b/magicmaus_AppNote.docx
@@ -380,19 +380,31 @@
         <w:t xml:space="preserve"> </w:t>
       </w:r>
       <w:r>
-        <w:t xml:space="preserve">model) demonstrates the method on genuine spectra and honestly bounds it: the</w:t>
-      </w:r>
-      <w:r>
-        <w:t xml:space="preserve"> </w:t>
-      </w:r>
-      <w:r>
-        <w:t xml:space="preserve">never-exclude envelope is 95.3% — conditional, unlike the simulated targets, on</w:t>
-      </w:r>
-      <w:r>
-        <w:t xml:space="preserve"> </w:t>
-      </w:r>
-      <w:r>
-        <w:t xml:space="preserve">the measured NOEs being consistent with the (predicted) structure — and treating</w:t>
+        <w:t xml:space="preserve">model) demonstrates the method on genuine spectra and honestly bounds it: reciprocal</w:t>
+      </w:r>
+      <w:r>
+        <w:t xml:space="preserve"> </w:t>
+      </w:r>
+      <w:r>
+        <w:t xml:space="preserve">symmetric NOESY pairing reaches a 98.8% never-exclude envelope (one peak carries an</w:t>
+      </w:r>
+      <w:r>
+        <w:t xml:space="preserve"> </w:t>
+      </w:r>
+      <w:r>
+        <w:t xml:space="preserve">NOE the predicted structure cannot support), while the plain carbon-only match is</w:t>
+      </w:r>
+      <w:r>
+        <w:t xml:space="preserve"> </w:t>
+      </w:r>
+      <w:r>
+        <w:t xml:space="preserve">UNSAT on this dense trimer — conditional, unlike the simulated targets, on the</w:t>
+      </w:r>
+      <w:r>
+        <w:t xml:space="preserve"> </w:t>
+      </w:r>
+      <w:r>
+        <w:t xml:space="preserve">measured NOEs being consistent with the (predicted) structure — and treating</w:t>
       </w:r>
       <w:r>
         <w:t xml:space="preserve"> </w:t>
@@ -1949,13 +1961,13 @@
         <w:pStyle w:val="BodyText"/>
       </w:pPr>
       <w:r>
-        <w:t xml:space="preserve">On the real-experimental TNF-α homotrimer (matched at the wider H±0.02/C±0.1 ppm</w:t>
-      </w:r>
-      <w:r>
-        <w:t xml:space="preserve"> </w:t>
-      </w:r>
-      <w:r>
-        <w:t xml:space="preserve">tolerance its broader linewidths require) the method behaves consistently with the</w:t>
+        <w:t xml:space="preserve">On the real-experimental TNF-α homotrimer (matched at H±0.01/C±0.05 with reciprocal</w:t>
+      </w:r>
+      <w:r>
+        <w:t xml:space="preserve"> </w:t>
+      </w:r>
+      <w:r>
+        <w:t xml:space="preserve">symmetric NOESY pairing) the method behaves consistently with the</w:t>
       </w:r>
       <w:r>
         <w:t xml:space="preserve"> </w:t>
@@ -1967,115 +1979,143 @@
         <w:t xml:space="preserve"> </w:t>
       </w:r>
       <w:r>
-        <w:t xml:space="preserve">(Table 1). First, multimer handling is load-bearing: parsed as a single protomer,</w:t>
-      </w:r>
-      <w:r>
-        <w:t xml:space="preserve"> </w:t>
-      </w:r>
-      <w:r>
-        <w:t xml:space="preserve">6 of the measured inter-subunit NOEs have no structural explanation and drop from</w:t>
-      </w:r>
-      <w:r>
-        <w:t xml:space="preserve"> </w:t>
-      </w:r>
-      <w:r>
-        <w:t xml:space="preserve">the envelope (75/85); retaining the three chains as symmetry images (contact =</w:t>
-      </w:r>
-      <w:r>
-        <w:t xml:space="preserve"> </w:t>
-      </w:r>
-      <w:r>
-        <w:t xml:space="preserve">minimum distance over subunits) explains them and recovers a coherent 95.3%</w:t>
-      </w:r>
-      <w:r>
-        <w:t xml:space="preserve"> </w:t>
-      </w:r>
-      <w:r>
-        <w:t xml:space="preserve">envelope (81/85). Second, the never-exclude guarantee is conditional on the NOEs</w:t>
-      </w:r>
-      <w:r>
-        <w:t xml:space="preserve"> </w:t>
-      </w:r>
-      <w:r>
-        <w:t xml:space="preserve">being consistent with the structure — a condition simulated data satisfies by</w:t>
-      </w:r>
-      <w:r>
-        <w:t xml:space="preserve"> </w:t>
-      </w:r>
-      <w:r>
-        <w:t xml:space="preserve">construction. Measured against an AlphaFold3 model, 4 of 85 peaks (Val13γ1,</w:t>
-      </w:r>
-      <w:r>
-        <w:t xml:space="preserve"> </w:t>
-      </w:r>
-      <w:r>
-        <w:t xml:space="preserve">Ala22β, Leu29δ1, Leu94δ1) carry NOEs the predicted structure does not support at</w:t>
-      </w:r>
-      <w:r>
-        <w:t xml:space="preserve"> </w:t>
-      </w:r>
-      <w:r>
-        <w:t xml:space="preserve">the 6/10 Å cutoffs and fall out of the envelope, so the real-world figure is</w:t>
-      </w:r>
-      <w:r>
-        <w:t xml:space="preserve"> </w:t>
-      </w:r>
-      <w:r>
-        <w:t xml:space="preserve">95.3%, not 100%. Committed accuracy (14.1%; 11.8% with soft evidence) is lower</w:t>
-      </w:r>
-      <w:r>
-        <w:t xml:space="preserve"> </w:t>
-      </w:r>
-      <w:r>
-        <w:t xml:space="preserve">than the simulated targets, as expected for a sparse, boolean-dominated (H)CCH</w:t>
-      </w:r>
-      <w:r>
-        <w:t xml:space="preserve"> </w:t>
-      </w:r>
-      <w:r>
-        <w:t xml:space="preserve">network — only 37 of 220 cross peaks resolve to a firm constraint at this wide</w:t>
-      </w:r>
-      <w:r>
-        <w:t xml:space="preserve"> </w:t>
-      </w:r>
-      <w:r>
-        <w:t xml:space="preserve">tolerance — with raw peak-height intensities scored against a predicted fold. The</w:t>
-      </w:r>
-      <w:r>
-        <w:t xml:space="preserve"> </w:t>
-      </w:r>
-      <w:r>
-        <w:t xml:space="preserve">optional HMBC lever is the one experimental input that helps here, lifting the</w:t>
-      </w:r>
-      <w:r>
-        <w:t xml:space="preserve"> </w:t>
-      </w:r>
-      <w:r>
-        <w:t xml:space="preserve">committed call from 11.8 to 17.6% by coupling the geminal pairs’ NOE evidence</w:t>
-      </w:r>
-      <w:r>
-        <w:t xml:space="preserve"> </w:t>
-      </w:r>
-      <w:r>
-        <w:t xml:space="preserve">(and, at the tighter H±0.01/C±0.05 tolerance, from 28.2 to 29.4% at a 92.9%</w:t>
-      </w:r>
-      <w:r>
-        <w:t xml:space="preserve"> </w:t>
-      </w:r>
-      <w:r>
-        <w:t xml:space="preserve">envelope). The HMBC-HMQC geminal peak list is clean enough — reciprocal</w:t>
-      </w:r>
-      <w:r>
-        <w:t xml:space="preserve"> </w:t>
-      </w:r>
-      <w:r>
-        <w:t xml:space="preserve">correlations for each Leu/Val pair — that its hard links inform rather than</w:t>
-      </w:r>
-      <w:r>
-        <w:t xml:space="preserve"> </w:t>
-      </w:r>
-      <w:r>
-        <w:t xml:space="preserve">over-constrain, never rendering the SAT infeasible.</w:t>
+        <w:t xml:space="preserve">(Table 1). First, multimer handling is load-bearing: with the same reciprocal</w:t>
+      </w:r>
+      <w:r>
+        <w:t xml:space="preserve"> </w:t>
+      </w:r>
+      <w:r>
+        <w:t xml:space="preserve">symmetric NOE edges, parsing the structure as a single protomer leaves 10 measured</w:t>
+      </w:r>
+      <w:r>
+        <w:t xml:space="preserve"> </w:t>
+      </w:r>
+      <w:r>
+        <w:t xml:space="preserve">inter-subunit contacts without a structural home and drops them from the envelope</w:t>
+      </w:r>
+      <w:r>
+        <w:t xml:space="preserve"> </w:t>
+      </w:r>
+      <w:r>
+        <w:t xml:space="preserve">(75/85 = 88.2%); retaining the three chains as symmetry images (contact = minimum</w:t>
+      </w:r>
+      <w:r>
+        <w:t xml:space="preserve"> </w:t>
+      </w:r>
+      <w:r>
+        <w:t xml:space="preserve">distance over subunits) explains 9 of them and recovers a 98.8% envelope (84/85).</w:t>
+      </w:r>
+      <w:r>
+        <w:t xml:space="preserve"> </w:t>
+      </w:r>
+      <w:r>
+        <w:t xml:space="preserve">Second, the never-exclude guarantee is conditional on the NOEs being consistent with</w:t>
+      </w:r>
+      <w:r>
+        <w:t xml:space="preserve"> </w:t>
+      </w:r>
+      <w:r>
+        <w:t xml:space="preserve">the structure — a condition simulated data satisfies by construction. Measured</w:t>
+      </w:r>
+      <w:r>
+        <w:t xml:space="preserve"> </w:t>
+      </w:r>
+      <w:r>
+        <w:t xml:space="preserve">against an AlphaFold3 model, one peak (Leu76δ2) carries a symmetric-confirmed NOE the</w:t>
+      </w:r>
+      <w:r>
+        <w:t xml:space="preserve"> </w:t>
+      </w:r>
+      <w:r>
+        <w:t xml:space="preserve">predicted structure does not support at the 6/10 Å cutoffs and falls out of the</w:t>
+      </w:r>
+      <w:r>
+        <w:t xml:space="preserve"> </w:t>
+      </w:r>
+      <w:r>
+        <w:t xml:space="preserve">envelope, so the real-world figure is 98.8%, not 100%. (Reciprocal symmetric pairing</w:t>
+      </w:r>
+      <w:r>
+        <w:t xml:space="preserve"> </w:t>
+      </w:r>
+      <w:r>
+        <w:t xml:space="preserve">is what makes even this bound attainable: the plain carbon-only firm match — resolving</w:t>
+      </w:r>
+      <w:r>
+        <w:t xml:space="preserve"> </w:t>
+      </w:r>
+      <w:r>
+        <w:t xml:space="preserve">the partner by carbon alone — collects mutually inconsistent hard edges on this dense</w:t>
+      </w:r>
+      <w:r>
+        <w:t xml:space="preserve"> </w:t>
+      </w:r>
+      <w:r>
+        <w:t xml:space="preserve">trimer and is UNSAT outright, so it commits nothing; pairing each row with its</w:t>
+      </w:r>
+      <w:r>
+        <w:t xml:space="preserve"> </w:t>
+      </w:r>
+      <w:r>
+        <w:t xml:space="preserve">reciprocal resolves both ends by full (C,H) and every retained edge is a real</w:t>
+      </w:r>
+      <w:r>
+        <w:t xml:space="preserve"> </w:t>
+      </w:r>
+      <w:r>
+        <w:t xml:space="preserve">methyl–methyl contact.) Committed accuracy is 34.1% methyl (31.8% before soft</w:t>
+      </w:r>
+      <w:r>
+        <w:t xml:space="preserve"> </w:t>
+      </w:r>
+      <w:r>
+        <w:t xml:space="preserve">evidence) and 55.3% at residue level — short of the simulated targets, as expected for</w:t>
+      </w:r>
+      <w:r>
+        <w:t xml:space="preserve"> </w:t>
+      </w:r>
+      <w:r>
+        <w:t xml:space="preserve">a boolean-dominated (H)CCH network scored against a predicted fold. The 21-point</w:t>
+      </w:r>
+      <w:r>
+        <w:t xml:space="preserve"> </w:t>
+      </w:r>
+      <w:r>
+        <w:t xml:space="preserve">methyl-vs-residue gap is entirely geminal swaps: right residue, wrong δ1/δ2 or γ1/γ2</w:t>
+      </w:r>
+      <w:r>
+        <w:t xml:space="preserve"> </w:t>
+      </w:r>
+      <w:r>
+        <w:t xml:space="preserve">(Table 3). The optional HMBC lever does</w:t>
+      </w:r>
+      <w:r>
+        <w:t xml:space="preserve"> </w:t>
+      </w:r>
+      <w:r>
+        <w:rPr>
+          <w:i/>
+          <w:iCs/>
+        </w:rPr>
+        <w:t xml:space="preserve">not</w:t>
+      </w:r>
+      <w:r>
+        <w:t xml:space="preserve"> </w:t>
+      </w:r>
+      <w:r>
+        <w:t xml:space="preserve">help this run — only one geminal link</w:t>
+      </w:r>
+      <w:r>
+        <w:t xml:space="preserve"> </w:t>
+      </w:r>
+      <w:r>
+        <w:t xml:space="preserve">matches the peaks at H±0.01/C±0.05, and adding it to the already max-feasible commit</w:t>
+      </w:r>
+      <w:r>
+        <w:t xml:space="preserve"> </w:t>
+      </w:r>
+      <w:r>
+        <w:t xml:space="preserve">set tips the SAT infeasible rather than orienting the pairs (Table 1, n.r.).</w:t>
       </w:r>
     </w:p>
     <w:p>
@@ -2117,7 +2157,19 @@
         <w:t xml:space="preserve"> </w:t>
       </w:r>
       <w:r>
-        <w:t xml:space="preserve">truth (never-exclude guarantee). n.c. = did not converge within a 15-min budget.</w:t>
+        <w:t xml:space="preserve">truth (never-exclude guarantee). n.c. = did not converge within a 15-min budget;</w:t>
+      </w:r>
+      <w:r>
+        <w:t xml:space="preserve"> </w:t>
+      </w:r>
+      <w:r>
+        <w:t xml:space="preserve">n.r. = not reported (the single matched HMBC link over-constrains TNF-α’s</w:t>
+      </w:r>
+      <w:r>
+        <w:t xml:space="preserve"> </w:t>
+      </w:r>
+      <w:r>
+        <w:t xml:space="preserve">max-feasible commit set, tipping the SAT infeasible).</w:t>
       </w:r>
     </w:p>
     <w:tbl>
@@ -3172,7 +3224,7 @@
               <w:jc w:val="right"/>
             </w:pPr>
             <w:r>
-              <w:t xml:space="preserve">14.1%</w:t>
+              <w:t xml:space="preserve">31.8%</w:t>
             </w:r>
           </w:p>
         </w:tc>
@@ -3184,7 +3236,7 @@
               <w:jc w:val="right"/>
             </w:pPr>
             <w:r>
-              <w:t xml:space="preserve">11.8%</w:t>
+              <w:t xml:space="preserve">34.1%</w:t>
             </w:r>
           </w:p>
         </w:tc>
@@ -3196,7 +3248,7 @@
               <w:jc w:val="right"/>
             </w:pPr>
             <w:r>
-              <w:t xml:space="preserve">17.6%</w:t>
+              <w:t xml:space="preserve">n.r.</w:t>
             </w:r>
           </w:p>
         </w:tc>
@@ -3208,7 +3260,7 @@
               <w:jc w:val="right"/>
             </w:pPr>
             <w:r>
-              <w:t xml:space="preserve">95.3%</w:t>
+              <w:t xml:space="preserve">98.8%</w:t>
             </w:r>
           </w:p>
         </w:tc>
@@ -3267,31 +3319,74 @@
         <w:t xml:space="preserve"> </w:t>
       </w:r>
       <w:r>
-        <w:t xml:space="preserve">homotrimer, scored against an AlphaFold3 trimer model. Because its measured</w:t>
-      </w:r>
-      <w:r>
-        <w:t xml:space="preserve"> </w:t>
-      </w:r>
-      <w:r>
-        <w:t xml:space="preserve">linewidths are broader than the simulated targets’, it is matched at the wider</w:t>
-      </w:r>
-      <w:r>
-        <w:t xml:space="preserve"> </w:t>
-      </w:r>
-      <w:r>
-        <w:t xml:space="preserve">tolerance H±0.02/C±0.1 ppm (vs H±0.01/C±0.05 for the rest). It exposes two</w:t>
-      </w:r>
-      <w:r>
-        <w:t xml:space="preserve"> </w:t>
-      </w:r>
-      <w:r>
-        <w:t xml:space="preserve">properties the simulated targets cannot (detailed below): the never-exclude</w:t>
-      </w:r>
-      <w:r>
-        <w:t xml:space="preserve"> </w:t>
-      </w:r>
-      <w:r>
-        <w:t xml:space="preserve">envelope is conditional on NOE–structure consistency (95.3%, not 100%, against a</w:t>
+        <w:t xml:space="preserve">homotrimer, scored against an AlphaFold3 trimer model, and matched at H±0.01/C±0.05</w:t>
+      </w:r>
+      <w:r>
+        <w:t xml:space="preserve"> </w:t>
+      </w:r>
+      <w:r>
+        <w:t xml:space="preserve">like the rest. Its NOESY match uses</w:t>
+      </w:r>
+      <w:r>
+        <w:t xml:space="preserve"> </w:t>
+      </w:r>
+      <w:r>
+        <w:rPr>
+          <w:b/>
+          <w:bCs/>
+        </w:rPr>
+        <w:t xml:space="preserve">reciprocal symmetric pairing</w:t>
+      </w:r>
+      <w:r>
+        <w:t xml:space="preserve">: a 3D (H)CCH row</w:t>
+      </w:r>
+      <w:r>
+        <w:t xml:space="preserve"> </w:t>
+      </w:r>
+      <w:r>
+        <w:t xml:space="preserve">gives the partner only by carbon, but the reciprocal row supplies the partner’s</w:t>
+      </w:r>
+      <w:r>
+        <w:t xml:space="preserve"> </w:t>
+      </w:r>
+      <w:r>
+        <w:t xml:space="preserve">proton, so pairing the two resolves both NOE ends by full (C,H) and every firm edge</w:t>
+      </w:r>
+      <w:r>
+        <w:t xml:space="preserve"> </w:t>
+      </w:r>
+      <w:r>
+        <w:t xml:space="preserve">is a correct methyl–methyl contact — the envelope reaches 98.8% with no wrong hard</w:t>
+      </w:r>
+      <w:r>
+        <w:t xml:space="preserve"> </w:t>
+      </w:r>
+      <w:r>
+        <w:t xml:space="preserve">constraint (the plain carbon-only firm match is UNSAT on this dense trimer). Multimer</w:t>
+      </w:r>
+      <w:r>
+        <w:t xml:space="preserve"> </w:t>
+      </w:r>
+      <w:r>
+        <w:t xml:space="preserve">handling is load-bearing: treating the three chains as symmetry images (a contact is</w:t>
+      </w:r>
+      <w:r>
+        <w:t xml:space="preserve"> </w:t>
+      </w:r>
+      <w:r>
+        <w:t xml:space="preserve">the minimum distance over subunits) explains the inter-subunit NOEs; with the same</w:t>
+      </w:r>
+      <w:r>
+        <w:t xml:space="preserve"> </w:t>
+      </w:r>
+      <w:r>
+        <w:t xml:space="preserve">symmetric edges the trimer parse recovers 84/85 vs 75/85 single-protomer, and the one</w:t>
+      </w:r>
+      <w:r>
+        <w:t xml:space="preserve"> </w:t>
+      </w:r>
+      <w:r>
+        <w:t xml:space="preserve">remaining peak (Leu76δ2) carries an NOE the</w:t>
       </w:r>
       <w:r>
         <w:t xml:space="preserve"> </w:t>
@@ -3307,43 +3402,49 @@
         <w:t xml:space="preserve"> </w:t>
       </w:r>
       <w:r>
-        <w:t xml:space="preserve">structure), and multimer handling — treating the three chains as</w:t>
-      </w:r>
-      <w:r>
-        <w:t xml:space="preserve"> </w:t>
-      </w:r>
-      <w:r>
-        <w:t xml:space="preserve">symmetry images so a contact is the minimum distance over subunits — is required</w:t>
-      </w:r>
-      <w:r>
-        <w:t xml:space="preserve"> </w:t>
-      </w:r>
-      <w:r>
-        <w:t xml:space="preserve">to explain the inter-subunit NOEs, recovering 6 further peaks in the envelope</w:t>
-      </w:r>
-      <w:r>
-        <w:t xml:space="preserve"> </w:t>
-      </w:r>
-      <w:r>
-        <w:t xml:space="preserve">(81/85 vs 75/85 single-protomer). The MAUS column is the fraction of peaks it</w:t>
-      </w:r>
-      <w:r>
-        <w:t xml:space="preserve"> </w:t>
-      </w:r>
-      <w:r>
-        <w:t xml:space="preserve">commits uniquely (all correct); at this wide tolerance none is uniquely forced, so</w:t>
-      </w:r>
-      <w:r>
-        <w:t xml:space="preserve"> </w:t>
-      </w:r>
-      <w:r>
-        <w:t xml:space="preserve">its coverage is entirely the Envelope column. The +HMBC column adds an optional</w:t>
-      </w:r>
-      <w:r>
-        <w:t xml:space="preserve"> </w:t>
-      </w:r>
-      <w:r>
-        <w:t xml:space="preserve">HMBC-HMQC geminal-link experiment (</w:t>
+        <w:t xml:space="preserve">structure does not support</w:t>
+      </w:r>
+      <w:r>
+        <w:t xml:space="preserve"> </w:t>
+      </w:r>
+      <w:r>
+        <w:t xml:space="preserve">(the conditional-envelope caveat below). The commit engine grows a max-feasible hard</w:t>
+      </w:r>
+      <w:r>
+        <w:t xml:space="preserve"> </w:t>
+      </w:r>
+      <w:r>
+        <w:t xml:space="preserve">set — the symmetric seed plus the carbon-only firm edges that keep the SAT feasible —</w:t>
+      </w:r>
+      <w:r>
+        <w:t xml:space="preserve"> </w:t>
+      </w:r>
+      <w:r>
+        <w:t xml:space="preserve">so it prunes enough to commit (its own envelope drops, but the reported Envelope column</w:t>
+      </w:r>
+      <w:r>
+        <w:t xml:space="preserve"> </w:t>
+      </w:r>
+      <w:r>
+        <w:t xml:space="preserve">is engE’s 98.8%). The MAUS column is the fraction of peaks committed uniquely (all</w:t>
+      </w:r>
+      <w:r>
+        <w:t xml:space="preserve"> </w:t>
+      </w:r>
+      <w:r>
+        <w:t xml:space="preserve">correct); none is uniquely forced here, so its coverage is entirely the Envelope</w:t>
+      </w:r>
+      <w:r>
+        <w:t xml:space="preserve"> </w:t>
+      </w:r>
+      <w:r>
+        <w:t xml:space="preserve">column. The +HMBC column would add the optional HMBC-HMQC geminal-link experiment</w:t>
+      </w:r>
+      <w:r>
+        <w:t xml:space="preserve"> </w:t>
+      </w:r>
+      <w:r>
+        <w:t xml:space="preserve">(</w:t>
       </w:r>
       <w:r>
         <w:rPr>
@@ -3352,19 +3453,19 @@
         <w:t xml:space="preserve">--hmbc</w:t>
       </w:r>
       <w:r>
-        <w:t xml:space="preserve">) on top of +soft, forcing each</w:t>
-      </w:r>
-      <w:r>
-        <w:t xml:space="preserve"> </w:t>
-      </w:r>
-      <w:r>
-        <w:t xml:space="preserve">Leu/Val geminal pair onto its two structural methyls; on TNF-α it is the one</w:t>
-      </w:r>
-      <w:r>
-        <w:t xml:space="preserve"> </w:t>
-      </w:r>
-      <w:r>
-        <w:t xml:space="preserve">experimental lever that helps (11.8→17.6%).</w:t>
+        <w:t xml:space="preserve">) on top of +soft; only one geminal link matches at this tolerance and adding</w:t>
+      </w:r>
+      <w:r>
+        <w:t xml:space="preserve"> </w:t>
+      </w:r>
+      <w:r>
+        <w:t xml:space="preserve">it to the already max-feasible commit set tips the SAT infeasible, so it is not reported</w:t>
+      </w:r>
+      <w:r>
+        <w:t xml:space="preserve"> </w:t>
+      </w:r>
+      <w:r>
+        <w:t xml:space="preserve">(n.r.).</w:t>
       </w:r>
     </w:p>
     <w:p>
@@ -4377,51 +4478,51 @@
               <w:pStyle w:val="Compact"/>
             </w:pPr>
             <w:r>
-              <w:t xml:space="preserve">38% (3/8)</w:t>
-            </w:r>
-          </w:p>
-        </w:tc>
-        <w:tc>
-          <w:tcPr/>
-          <w:p>
-            <w:pPr>
-              <w:pStyle w:val="Compact"/>
-            </w:pPr>
-            <w:r>
-              <w:t xml:space="preserve">3% (1/36)</w:t>
-            </w:r>
-          </w:p>
-        </w:tc>
-        <w:tc>
-          <w:tcPr/>
-          <w:p>
-            <w:pPr>
-              <w:pStyle w:val="Compact"/>
-            </w:pPr>
-            <w:r>
-              <w:t xml:space="preserve">12% (3/26)</w:t>
-            </w:r>
-          </w:p>
-        </w:tc>
-        <w:tc>
-          <w:tcPr/>
-          <w:p>
-            <w:pPr>
-              <w:pStyle w:val="Compact"/>
-            </w:pPr>
-            <w:r>
-              <w:t xml:space="preserve">25% (3/12)</w:t>
-            </w:r>
-          </w:p>
-        </w:tc>
-        <w:tc>
-          <w:tcPr/>
-          <w:p>
-            <w:pPr>
-              <w:pStyle w:val="Compact"/>
-            </w:pPr>
-            <w:r>
-              <w:t xml:space="preserve">0% (0/3)</w:t>
+              <w:t xml:space="preserve">100% (8/8)</w:t>
+            </w:r>
+          </w:p>
+        </w:tc>
+        <w:tc>
+          <w:tcPr/>
+          <w:p>
+            <w:pPr>
+              <w:pStyle w:val="Compact"/>
+            </w:pPr>
+            <w:r>
+              <w:t xml:space="preserve">25% (9/36)</w:t>
+            </w:r>
+          </w:p>
+        </w:tc>
+        <w:tc>
+          <w:tcPr/>
+          <w:p>
+            <w:pPr>
+              <w:pStyle w:val="Compact"/>
+            </w:pPr>
+            <w:r>
+              <w:t xml:space="preserve">19% (5/26)</w:t>
+            </w:r>
+          </w:p>
+        </w:tc>
+        <w:tc>
+          <w:tcPr/>
+          <w:p>
+            <w:pPr>
+              <w:pStyle w:val="Compact"/>
+            </w:pPr>
+            <w:r>
+              <w:t xml:space="preserve">50% (6/12)</w:t>
+            </w:r>
+          </w:p>
+        </w:tc>
+        <w:tc>
+          <w:tcPr/>
+          <w:p>
+            <w:pPr>
+              <w:pStyle w:val="Compact"/>
+            </w:pPr>
+            <w:r>
+              <w:t xml:space="preserve">33% (1/3)</w:t>
             </w:r>
           </w:p>
         </w:tc>
@@ -4443,7 +4544,7 @@
               <w:pStyle w:val="Compact"/>
             </w:pPr>
             <w:r>
-              <w:t xml:space="preserve">12% (10/85)</w:t>
+              <w:t xml:space="preserve">34% (29/85)</w:t>
             </w:r>
           </w:p>
         </w:tc>
@@ -4454,31 +4555,25 @@
         <w:pStyle w:val="BodyText"/>
       </w:pPr>
       <w:r>
-        <w:t xml:space="preserve">The real-data TNF-α row (matched at the wider H±0.02/C±0.1 tolerance) makes the</w:t>
-      </w:r>
-      <w:r>
-        <w:t xml:space="preserve"> </w:t>
-      </w:r>
-      <w:r>
-        <w:t xml:space="preserve">type dependence stark even as overall accuracy is low on this sparse network: Ile</w:t>
-      </w:r>
-      <w:r>
-        <w:t xml:space="preserve"> </w:t>
-      </w:r>
-      <w:r>
-        <w:t xml:space="preserve">(no geminal partner) is still the best-assigned type at 38%, while Leu collapses to</w:t>
-      </w:r>
-      <w:r>
-        <w:t xml:space="preserve"> </w:t>
-      </w:r>
-      <w:r>
-        <w:t xml:space="preserve">3% (1/36) and Val to 12% — the few firm NOEs cannot orient the geminal pairs, so</w:t>
-      </w:r>
-      <w:r>
-        <w:t xml:space="preserve"> </w:t>
-      </w:r>
-      <w:r>
-        <w:t xml:space="preserve">most Leu/Val calls are the</w:t>
+        <w:t xml:space="preserve">The real-data TNF-α row (symmetric-NOESY engine at H±0.01/C±0.05) makes the type</w:t>
+      </w:r>
+      <w:r>
+        <w:t xml:space="preserve"> </w:t>
+      </w:r>
+      <w:r>
+        <w:t xml:space="preserve">dependence stark even as overall accuracy is modest on this sparse network: Ile (no</w:t>
+      </w:r>
+      <w:r>
+        <w:t xml:space="preserve"> </w:t>
+      </w:r>
+      <w:r>
+        <w:t xml:space="preserve">geminal partner) is assigned outright at 100% (8/8), while Leu (25%) and Val (19%)</w:t>
+      </w:r>
+      <w:r>
+        <w:t xml:space="preserve"> </w:t>
+      </w:r>
+      <w:r>
+        <w:t xml:space="preserve">lag — the firm NOEs cannot orient the geminal pairs, so most Leu/Val calls are the</w:t>
       </w:r>
       <w:r>
         <w:t xml:space="preserve"> </w:t>
@@ -4493,19 +4588,25 @@
         <w:t xml:space="preserve"> </w:t>
       </w:r>
       <w:r>
-        <w:t xml:space="preserve">coin flip landing on the wrong δ/γ methyl</w:t>
-      </w:r>
-      <w:r>
-        <w:t xml:space="preserve"> </w:t>
-      </w:r>
-      <w:r>
-        <w:t xml:space="preserve">(they stay inside the MAUS envelope; only the intensity signal, weak here, could</w:t>
-      </w:r>
-      <w:r>
-        <w:t xml:space="preserve"> </w:t>
-      </w:r>
-      <w:r>
-        <w:t xml:space="preserve">break the tie).</w:t>
+        <w:t xml:space="preserve">coin flip landing on the wrong δ/γ methyl (they stay inside the MAUS</w:t>
+      </w:r>
+      <w:r>
+        <w:t xml:space="preserve"> </w:t>
+      </w:r>
+      <w:r>
+        <w:t xml:space="preserve">envelope; only the intensity signal, weak here, could break the tie). The</w:t>
+      </w:r>
+      <w:r>
+        <w:t xml:space="preserve"> </w:t>
+      </w:r>
+      <w:r>
+        <w:t xml:space="preserve">residue-level accuracy is 55% (47/85): the 21-point gap to the 34% methyl-level</w:t>
+      </w:r>
+      <w:r>
+        <w:t xml:space="preserve"> </w:t>
+      </w:r>
+      <w:r>
+        <w:t xml:space="preserve">figure is entirely geminal swaps — right residue, wrong δ1/δ2 or γ1/γ2.</w:t>
       </w:r>
     </w:p>
     <w:p>
@@ -5526,29 +5627,29 @@
               <w:pStyle w:val="Compact"/>
             </w:pPr>
             <w:r>
-              <w:t xml:space="preserve">38% (3/8)</w:t>
-            </w:r>
-          </w:p>
-        </w:tc>
-        <w:tc>
-          <w:tcPr/>
-          <w:p>
-            <w:pPr>
-              <w:pStyle w:val="Compact"/>
-            </w:pPr>
-            <w:r>
-              <w:t xml:space="preserve">6% (1/18)</w:t>
-            </w:r>
-          </w:p>
-        </w:tc>
-        <w:tc>
-          <w:tcPr/>
-          <w:p>
-            <w:pPr>
-              <w:pStyle w:val="Compact"/>
-            </w:pPr>
-            <w:r>
-              <w:t xml:space="preserve">0% (0/18)</w:t>
+              <w:t xml:space="preserve">100% (8/8)</w:t>
+            </w:r>
+          </w:p>
+        </w:tc>
+        <w:tc>
+          <w:tcPr/>
+          <w:p>
+            <w:pPr>
+              <w:pStyle w:val="Compact"/>
+            </w:pPr>
+            <w:r>
+              <w:t xml:space="preserve">22% (4/18)</w:t>
+            </w:r>
+          </w:p>
+        </w:tc>
+        <w:tc>
+          <w:tcPr/>
+          <w:p>
+            <w:pPr>
+              <w:pStyle w:val="Compact"/>
+            </w:pPr>
+            <w:r>
+              <w:t xml:space="preserve">28% (5/18)</w:t>
             </w:r>
           </w:p>
         </w:tc>
@@ -5570,29 +5671,29 @@
               <w:pStyle w:val="Compact"/>
             </w:pPr>
             <w:r>
-              <w:t xml:space="preserve">8% (1/13)</w:t>
-            </w:r>
-          </w:p>
-        </w:tc>
-        <w:tc>
-          <w:tcPr/>
-          <w:p>
-            <w:pPr>
-              <w:pStyle w:val="Compact"/>
-            </w:pPr>
-            <w:r>
-              <w:t xml:space="preserve">25% (3/12)</w:t>
-            </w:r>
-          </w:p>
-        </w:tc>
-        <w:tc>
-          <w:tcPr/>
-          <w:p>
-            <w:pPr>
-              <w:pStyle w:val="Compact"/>
-            </w:pPr>
-            <w:r>
-              <w:t xml:space="preserve">0% (0/3)</w:t>
+              <w:t xml:space="preserve">23% (3/13)</w:t>
+            </w:r>
+          </w:p>
+        </w:tc>
+        <w:tc>
+          <w:tcPr/>
+          <w:p>
+            <w:pPr>
+              <w:pStyle w:val="Compact"/>
+            </w:pPr>
+            <w:r>
+              <w:t xml:space="preserve">50% (6/12)</w:t>
+            </w:r>
+          </w:p>
+        </w:tc>
+        <w:tc>
+          <w:tcPr/>
+          <w:p>
+            <w:pPr>
+              <w:pStyle w:val="Compact"/>
+            </w:pPr>
+            <w:r>
+              <w:t xml:space="preserve">33% (1/3)</w:t>
             </w:r>
           </w:p>
         </w:tc>
@@ -6785,7 +6886,7 @@
           <wp:inline>
             <wp:extent cx="5334000" cy="2336521"/>
             <wp:effectExtent b="0" l="0" r="0" t="0"/>
-            <wp:docPr descr="Fig. 1. (A) The magicmaus pipeline. A SAT layer (MAUS) bounds each peak to a per-peak option set that provably contains the truth (100% envelope) and prunes candidates from up to ~60 to 1–3; an intensity-weighted NOE score (MAGIC-style), applied only within those bounds via a SAT-feasible seed and feasibility-preserving 3-cycle simulated annealing, commits to a single coherent map with a per-peak confidence tier (unique / scored / ambiguous). (B) Methyl-level accuracy across the seven structure-simulated benchmark targets (43–257 methyls, ordered by size) plus the real-experimental TNF-α homotrimer (real), all engines scored on the same 1/r6 intensity NOESY: magicmaus (+soft, blue) versus MAUS unique-only calls (purple; the constraint layer’s decisive fraction, abstaining elsewhere) and full-space MAGIC (red; hatched n.c.* where scoring did not converge within a 15-min budget). Green markers denote the truth-in-envelope guarantee — 100% on every simulated target, and 95.3% on real TNF-α data (matched at the wider H±0.02/C±0.1 tolerance), where a predicted structure cannot support 4 measured NOEs." title="" id="22" name="Picture"/>
+            <wp:docPr descr="Fig. 1. (A) The magicmaus pipeline. A SAT layer (MAUS) bounds each peak to a per-peak option set that provably contains the truth (100% envelope) and prunes candidates from up to ~60 to 1–3; an intensity-weighted NOE score (MAGIC-style), applied only within those bounds via a SAT-feasible seed and feasibility-preserving 3-cycle simulated annealing, commits to a single coherent map with a per-peak confidence tier (unique / scored / ambiguous). (B) Methyl-level accuracy across the seven structure-simulated benchmark targets (43–257 methyls, ordered by size) plus the real-experimental TNF-α homotrimer (real), all engines scored on the same 1/r6 intensity NOESY: magicmaus (+soft, blue) versus MAUS unique-only calls (purple; the constraint layer’s decisive fraction, abstaining elsewhere) and full-space MAGIC (red; hatched n.c.* where scoring did not converge within a 15-min budget). Green markers denote the truth-in-envelope guarantee — 100% on every simulated target, and 98.8% on real TNF-α data via reciprocal symmetric NOESY pairing (one peak carries an NOE the predicted structure cannot support; the plain carbon-only match is UNSAT on the dense trimer)." title="" id="22" name="Picture"/>
             <a:graphic>
               <a:graphicData uri="http://schemas.openxmlformats.org/drawingml/2006/picture">
                 <pic:pic>
@@ -6993,19 +7094,19 @@
         <w:t xml:space="preserve"> </w:t>
       </w:r>
       <w:r>
-        <w:t xml:space="preserve">guarantee — 100% on every simulated target, and 95.3% on real TNF-α data (matched</w:t>
-      </w:r>
-      <w:r>
-        <w:t xml:space="preserve"> </w:t>
-      </w:r>
-      <w:r>
-        <w:t xml:space="preserve">at the wider H±0.02/C±0.1 tolerance), where a predicted structure cannot support 4</w:t>
-      </w:r>
-      <w:r>
-        <w:t xml:space="preserve"> </w:t>
-      </w:r>
-      <w:r>
-        <w:t xml:space="preserve">measured NOEs.</w:t>
+        <w:t xml:space="preserve">guarantee — 100% on every simulated target, and 98.8% on real TNF-α data via</w:t>
+      </w:r>
+      <w:r>
+        <w:t xml:space="preserve"> </w:t>
+      </w:r>
+      <w:r>
+        <w:t xml:space="preserve">reciprocal symmetric NOESY pairing (one peak carries an NOE the predicted structure</w:t>
+      </w:r>
+      <w:r>
+        <w:t xml:space="preserve"> </w:t>
+      </w:r>
+      <w:r>
+        <w:t xml:space="preserve">cannot support; the plain carbon-only match is UNSAT on the dense trimer).</w:t>
       </w:r>
     </w:p>
     <w:bookmarkEnd w:id="24"/>

</xml_diff>